<commit_message>
Low-pH replacements: the reason per attribute, decided from the data
The PCP-006 factual check found that "the shorter hold, not a more stable product" is false for
acidic variants: every 180-min run of the low-pH design adds 0.60 points against the platform's 1.00
over the same hold. It holds for aggregate (0.84 at the edges against 0.70). INV-001 and PCMP-001 now
decide the wording per attribute from iac_verification.csv (observed_edge against assumed), and the
STORY_BIBLE canon says so. Both documents re-rendered and their annexes re-anchored.

Also: the PCP-006 factual report, and a lessons file for the plan authors still to come.

Gates: 21/21 annexes valid; GROUNDING_STRICT_ANCHORS=1 3251/3251.

Co-Authored-By: Claude Opus 5.5 <noreply@anthropic.com>
</commit_message>
<xml_diff>
--- a/pc_package/PCMP-001_master_plan.docx
+++ b/pc_package/PCMP-001_master_plan.docx
@@ -15552,7 +15552,7 @@
         </w:r>
       </w:hyperlink>
       <w:r>
-        <w:t xml:space="preserve">, 17 are in force at their a priori value and verification changed 5. The tightened criteria are the aggregate criteria upstream of cation exchange, because the cation exchange model gave a lower aggregate clearance than the platform worst case. One of them, the criterion for aggregate in the production bioreactor harvest (from 9.30 % to 6.46 %), was also widened, because the low-pH viral inactivation model gave a smaller aggregate increase (0.56 % at the prediction bound of a single batch, against 0.70 % on the platform). The result is a stricter criterion than the a priori one. The other tightened criterion is the criterion for aggregate in the viral inactivation pool (from 10.0 % to 7.02 %). The criteria only widened are the upper limit for acidic variants in the production bioreactor harvest (from 39.0 % to 39.6 %), the criterion for host cell protein in the Protein A pool (from 16,000 ng/mg to 17,069 ng/mg) and the criterion for host cell protein in the cation exchange pool (from 400 ng/mg to 427 ng/mg). The widening of the criteria for aggregate and acidic variants in the production bioreactor harvest reflects the shorter hold of A-Mab in low-pH viral inactivation, not a more stable product. The A-Mab hold is at most 120 min within its NOR as characterized, and the platform worst cases are increases over a hold of 180 min. Every report that relies on a changed criterion argues the change by its risk (</w:t>
+        <w:t xml:space="preserve">, 17 are in force at their a priori value and verification changed 5. The tightened criteria are the aggregate criteria upstream of cation exchange, because the cation exchange model gave a lower aggregate clearance than the platform worst case. One of them, the criterion for aggregate in the production bioreactor harvest (from 9.30 % to 6.46 %), was also widened, because the low-pH viral inactivation model gave a smaller aggregate increase (0.56 % at the prediction bound of a single batch, against 0.70 % on the platform). The result is a stricter criterion than the a priori one. The other tightened criterion is the criterion for aggregate in the viral inactivation pool (from 10.0 % to 7.02 %). The criteria only widened are the upper limit for acidic variants in the production bioreactor harvest (from 39.0 % to 39.6 %), the criterion for host cell protein in the Protein A pool (from 16,000 ng/mg to 17,069 ng/mg) and the criterion for host cell protein in the cation exchange pool (from 400 ng/mg to 427 ng/mg). The widening of the criteria for aggregate and acidic variants in the production bioreactor harvest comes from low-pH viral inactivation. There the A-Mab hold is at most 120 min within its NOR as characterized, and the platform worst cases are increases over a hold of 180 min. For aggregate the change reflects that shorter hold, not a more stable product. For acidic variants A-Mab adds less than the platform value even over a hold of 180 min. Every report that relies on a changed criterion argues the change by its risk (</w:t>
       </w:r>
       <w:hyperlink w:anchor="sec-verification">
         <w:r>
@@ -16185,7 +16185,7 @@
         <w:pStyle w:val="BodyText"/>
       </w:pPr>
       <w:r>
-        <w:t xml:space="preserve">The criteria assume 9 platform worst cases. Of these, 7 are responses of the response-surface designs of low-pH viral inactivation, cation exchange and anion exchange, and they can be checked. The other 2 are the leached Protein A clearance of cation exchange and of anion exchange. Leached Protein A is not a response of those designs, so the platform values stand. The prediction bound of a single batch was better than the platform worst case for the aggregate increase of low-pH viral inactivation, the acidic variants increase of low-pH viral inactivation and the host cell protein clearance of anion exchange, and these bounds replaced the platform values. The bounds that replaced the platform increases of aggregate and acidic variants in low-pH viral inactivation reflect the shorter hold of A-Mab, not a more stable product. The platform worst cases of the low-pH hold are increases over a hold of 180 min. The A-Mab bounds are the increases within the hold-time NOR as characterized, which ends at 120 min. The criteria calculated with them are still right, because routine manufacture never holds longer than the NOR.</w:t>
+        <w:t xml:space="preserve">The criteria assume 9 platform worst cases. Of these, 7 are responses of the response-surface designs of low-pH viral inactivation, cation exchange and anion exchange, and they can be checked. The other 2 are the leached Protein A clearance of cation exchange and of anion exchange. Leached Protein A is not a response of those designs, so the platform values stand. The prediction bound of a single batch was better than the platform worst case for the aggregate increase of low-pH viral inactivation, the acidic variants increase of low-pH viral inactivation and the host cell protein clearance of anion exchange, and these bounds replaced the platform values. The platform worst cases of the low-pH hold are increases over a hold of 180 min. The A-Mab bounds are the increases within the hold-time NOR as characterized, which ends at 120 min. For aggregate, the largest increase measured at the edges of the range studied, which include a hold of 180 min, is 0.84 percentage points, above the platform value of 0.70. Its replacement therefore reflects the shorter hold of A-Mab, not a more stable product. For acidic variants, the largest increase measured at the edges of the range studied is 0.60 percentage points, below the platform value of 1.00 even over a hold of 180 min. A-Mab therefore adds less than the platform products over the same hold, and its shorter hold lowers the increase further. The criteria calculated with these bounds are still right, because routine manufacture never holds longer than the NOR.</w:t>
       </w:r>
     </w:p>
     <w:p>

</xml_diff>

<commit_message>
PCP-005 and PCMP-001 follow the hold-study decision; PCP-003 within the amendment scope
- PCP-005: the hold study, its objective, criterion and table rows are out of the plan (PCR-005 records
  S-PA-HLD as PD-005-05); section 8.1 names anion exchange; the inline-source leak is gone. 36 pp.
- PCMP-001: the hold studies are described as made during the Version 2.0 re-analysis and recorded as
  discrepancies, a held pool is judged against the criteria it must meet entering the next step, and the
  response-surface factors are "carried forward from the screening" as Version 1.0 said, not a rule
  written after the data.
- Annexes of PCP-005 and PCMP-001 rebuilt; PCP-003 draft after its pass for the data and the amendment
  scope (39 pp). INV-002 sample-size table: probability of success. Procedures: the reviewer context for
  plans and the factual-pass prompt.

Gates: 21/21 annexes valid; GROUNDING_STRICT_ANCHORS=1 3243/3243.

Co-Authored-By: Claude Opus 5.5 <noreply@anthropic.com>
</commit_message>
<xml_diff>
--- a/pc_package/PCMP-001_master_plan.docx
+++ b/pc_package/PCMP-001_master_plan.docx
@@ -10476,16 +10476,18 @@
         <w:pStyle w:val="BodyText"/>
       </w:pPr>
       <w:r>
-        <w:t xml:space="preserve">Intermediate pools are held between steps. During a hold, aggregate can form, asparagine residues can deamidate and raise the acidic variants, and proteases in the clarified harvest can clip the antibody into fragments. Each of these raises its attribute with time. The campaign includes 3 hold studies. The clarified harvest and the Protein A eluate (at elution pH) are each held at 2-8 °C and 21 °C, and the neutralized viral inactivation pool at 21 °C and 25 °C, for up to 7 days. The design of the viral inactivation pool study follows A-Mab Table 4.17</w:t>
-      </w:r>
-      <w:r>
-        <w:t xml:space="preserve"> </w:t>
-      </w:r>
-      <w:r>
-        <w:t xml:space="preserve">(CMC Biotech Working Group 2009)</w:t>
-      </w:r>
-      <w:r>
-        <w:t xml:space="preserve">. Each hold study is planned in the PCP-00N of the step that produces the pool.</w:t>
+        <w:t xml:space="preserve">Intermediate pools are held between steps. During a hold, aggregate can form, asparagine residues can deamidate and raise the acidic variants, and proteases in the clarified harvest can clip the antibody into fragments. Each of these raises its attribute with time. Version 1.0 of the plans did not study a hold. During the Version 2.0 re-analysis, hold studies were made, from 2026-09-19 to 2026-09-29, on the clarified harvest, the Protein A eluate (at elution pH) and the neutralized viral inactivation pool. Each report records its hold study as a discrepancy from its plan, and no plan describes one. A held pool is judged against the intermediate acceptance criteria that it must meet when it enters the next step (</w:t>
+      </w:r>
+      <w:hyperlink w:anchor="sec-iac">
+        <w:r>
+          <w:rPr>
+            <w:rStyle w:val="Hyperlink"/>
+          </w:rPr>
+          <w:t xml:space="preserve">Section 7.3</w:t>
+        </w:r>
+      </w:hyperlink>
+      <w:r>
+        <w:t xml:space="preserve">).</w:t>
       </w:r>
     </w:p>
     <w:p>
@@ -11787,7 +11789,7 @@
         <w:pStyle w:val="FirstParagraph"/>
       </w:pPr>
       <w:r>
-        <w:t xml:space="preserve">Each step with a multivariate scope is studied in two stages, under the design of experiments procedure SOP-1002. A screening design comes first. It is a two-level factorial design, full or fractional as the number of factors requires, with replicated centre points. A response-surface design follows. It is a central composite design over the factors that screening showed, or RA-001 expected, to affect a CQA with a criterion at the step. It also has replicated centre points.</w:t>
+        <w:t xml:space="preserve">Each step with a multivariate scope is studied in two stages, under the design of experiments procedure SOP-1002. A screening design comes first. It is a two-level factorial design, full or fractional as the number of factors requires, with replicated centre points. A response-surface design follows. It is a central composite design over the factors that each step plan carries forward from the screening. It also has replicated centre points.</w:t>
       </w:r>
       <w:r>
         <w:t xml:space="preserve"> </w:t>
@@ -15505,7 +15507,7 @@
         </w:r>
       </w:hyperlink>
       <w:r>
-        <w:t xml:space="preserve">). Holds are covered by the hold studies, each planned in the PCP-00N of the step that produces the pool and judged against a hold criterion set in that plan.</w:t>
+        <w:t xml:space="preserve">). A held pool must therefore still meet the criteria of this section when it enters the next step. The reports judge the hold studies made during the Version 2.0 re-analysis against them.</w:t>
       </w:r>
     </w:p>
     <w:p>

</xml_diff>

<commit_message>
PCMP-001 §7.5 widening rule names its three tests; PTP-001 and RA-001 drafts; plan reviews and fix lists
- PCMP-001 §7.5 rule 2: the bound replaces the platform value where the model meets the first
  three adequacy criteria of §7.2 and is not an exact fit; the fourth criterion does not decide the
  change, and the report that gives the bound examines it. The design space is drawn on the
  single-batch limit (judgement statistics). Re-rendered; annex re-grounded.
- CLAUDE.md, STORY_BIBLE §9b and the INV-002 CAPA record (PA1, effectiveness check) say the same.
- PTP-001 and RA-001 Version 2.0 drafts (33 pp each, gates green), under review.
- Reviews and factual checks of PCP-007, PCP-008 and PCP-009; shared resolutions for the three
  plans and a fix list for each (PCP-008: the Version 1.0 coding statement restored, D-001).
- PCP-010 review run 2 and its final fix list.

Co-Authored-By: Claude Opus 5.5 <noreply@anthropic.com>
</commit_message>
<xml_diff>
--- a/pc_package/PCMP-001_master_plan.docx
+++ b/pc_package/PCMP-001_master_plan.docx
@@ -12663,7 +12663,7 @@
         <w:pStyle w:val="BodyText"/>
       </w:pPr>
       <w:r>
-        <w:t xml:space="preserve">A response-surface model predicts the mean response over the range studied. At the edge of an acceptable region defined on mean predictions, a single batch meets its criterion about half the time if variability is symmetrical. For this reason a quality attribute is judged on a single batch, not on the mean prediction, in three analyses. The NOR-propagated proven acceptable range (</w:t>
+        <w:t xml:space="preserve">A response-surface model predicts the mean response over the range studied. At the edge of an acceptable region defined on mean predictions, a single batch meets its criterion about half the time if variability is symmetrical. For this reason a quality attribute is judged on a single batch, not on the mean prediction, in four analyses. The NOR-propagated proven acceptable range (</w:t>
       </w:r>
       <w:hyperlink w:anchor="sec-par">
         <w:r>
@@ -12696,7 +12696,7 @@
         </w:r>
       </w:hyperlink>
       <w:r>
-        <w:t xml:space="preserve">) uses the one-sided 95 % prediction bound of a single batch at the least favourable of these combinations.</w:t>
+        <w:t xml:space="preserve">) uses the one-sided 95 % prediction bound of a single batch at the least favourable of these combinations. The design space of a step is drawn on the same statistic. A setting of its response-surface parameters lies inside it when every quality attribute meets its criterion at both ends of the 95 % prediction interval of a single run, and viral clearance on its mean prediction.</w:t>
       </w:r>
     </w:p>
     <w:bookmarkEnd w:id="38"/>
@@ -13129,7 +13129,7 @@
         </w:r>
       </w:hyperlink>
       <w:r>
-        <w:t xml:space="preserve">). The prediction bound of the cation exchange clearance does not exceed its platform worst case of 40-fold, so the platform value stands. The prediction bound of the anion exchange clearance exceeds its platform worst case of 4-fold, and the anion exchange model of host cell protein meets the model adequacy criteria, so the bound replaced the platform value (</w:t>
+        <w:t xml:space="preserve">). The prediction bound of the cation exchange clearance does not exceed its platform worst case of 40-fold, so the platform value stands. The prediction bound of the anion exchange clearance exceeds its platform worst case of 4-fold, and the anion exchange model of host cell protein meets the three adequacy criteria that the rule names, so the bound replaced the platform value (</w:t>
       </w:r>
       <w:hyperlink w:anchor="sec-acc-model">
         <w:r>
@@ -16047,7 +16047,7 @@
         </w:numPr>
       </w:pPr>
       <w:r>
-        <w:t xml:space="preserve">Where the prediction bound of a single batch is better than the platform value, and the response-surface model behind it meets the adequacy criteria of</w:t>
+        <w:t xml:space="preserve">Where the prediction bound of a single batch is better than the platform value, and the response-surface model behind it meets the first three adequacy criteria of</w:t>
       </w:r>
       <w:r>
         <w:t xml:space="preserve"> </w:t>
@@ -16061,7 +16061,10 @@
         </w:r>
       </w:hyperlink>
       <w:r>
-        <w:t xml:space="preserve">, the bound replaces the platform value. Every criterion upstream of that step is recalculated with it and becomes wider.</w:t>
+        <w:t xml:space="preserve"> </w:t>
+      </w:r>
+      <w:r>
+        <w:t xml:space="preserve">(a significant model, no significant lack of fit and the limit on overfitting) and is not an exact fit, the bound replaces the platform value. The fourth criterion, on the residuals and on influential runs, does not decide the change. The report that gives the bound examines it and states whether the bound depends on a single run. Every criterion upstream of that step is recalculated with it and becomes wider.</w:t>
       </w:r>
     </w:p>
     <w:p>
@@ -16189,7 +16192,7 @@
         <w:pStyle w:val="BodyText"/>
       </w:pPr>
       <w:r>
-        <w:t xml:space="preserve">For the acidic variants increase of low-pH viral inactivation the prediction bound of a single batch was also better, but the model does not meet the model adequacy criteria, so the platform values stand. For the fragments increase of low-pH viral inactivation, the host cell protein clearance of cation exchange and the fragments clearance of cation exchange, the predicted worst case confirmed the platform worst case, but the prediction bound of a single batch is not better than it, so the platform values stand. Verification found that the aggregate clearance of cation exchange within its NOR is lower than the platform worst case. That tightened the aggregate criteria upstream of cation exchange (</w:t>
+        <w:t xml:space="preserve">For the acidic variants increase of low-pH viral inactivation the prediction bound of a single batch was also better, but the model does not meet the three adequacy criteria that the rule names, so the platform values stand. For the fragments increase of low-pH viral inactivation, the host cell protein clearance of cation exchange and the fragments clearance of cation exchange, the predicted worst case confirmed the platform worst case, but the prediction bound of a single batch is not better than it, so the platform values stand. Verification found that the aggregate clearance of cation exchange within its NOR is lower than the platform worst case. That tightened the aggregate criteria upstream of cation exchange (</w:t>
       </w:r>
       <w:hyperlink w:anchor="sec-iac">
         <w:r>

</xml_diff>

<commit_message>
Parameter table fits its page; check_render fails text that runs into the page foot
- T.parameters_by_step: the study type is a mark on the parameter instead of a column, and the freed
  width goes to the columns that wrapped. The table for the whole train ran 58 pt into the page foot
  of PCMP-001 (its last notes printed over the page number); it now ends above the foot at the same
  font size (found by the PTP-001 author).
- check_render.check_footer_clear: on every upright page, no line may reach into the band of the
  page number. check_tables_fit could not see this overflow because the text was still in the PDF.
  Run over every rendered PDF in pc_package/, it flags only this table.
- PCMP-001 re-rendered (39 pp, all gates OK); annex rebuilt, 535/535 quotes grounded.

Co-Authored-By: Claude Opus 5.5 <noreply@anthropic.com>
</commit_message>
<xml_diff>
--- a/pc_package/PCMP-001_master_plan.docx
+++ b/pc_package/PCMP-001_master_plan.docx
@@ -5553,14 +5553,13 @@
               <w:tblLook w:firstRow="1" w:lastRow="1" w:firstColumn="0" w:lastColumn="0" w:noHBand="0" w:noVBand="0" w:val="0020"/>
             </w:tblPr>
             <w:tblGrid>
-              <w:gridCol w:w="990"/>
-              <w:gridCol w:w="990"/>
-              <w:gridCol w:w="990"/>
-              <w:gridCol w:w="990"/>
-              <w:gridCol w:w="990"/>
-              <w:gridCol w:w="990"/>
-              <w:gridCol w:w="990"/>
-              <w:gridCol w:w="990"/>
+              <w:gridCol w:w="1131"/>
+              <w:gridCol w:w="1131"/>
+              <w:gridCol w:w="1131"/>
+              <w:gridCol w:w="1131"/>
+              <w:gridCol w:w="1131"/>
+              <w:gridCol w:w="1131"/>
+              <w:gridCol w:w="1131"/>
             </w:tblGrid>
             <w:tr>
               <w:trPr>
@@ -5652,18 +5651,6 @@
                     <w:jc w:val="center"/>
                   </w:pPr>
                   <w:r>
-                    <w:t xml:space="preserve">Study</w:t>
-                  </w:r>
-                </w:p>
-              </w:tc>
-              <w:tc>
-                <w:tcPr/>
-                <w:p>
-                  <w:pPr>
-                    <w:pStyle w:val="Compact"/>
-                    <w:jc w:val="center"/>
-                  </w:pPr>
-                  <w:r>
                     <w:t xml:space="preserve">Class</w:t>
                   </w:r>
                 </w:p>
@@ -5741,18 +5728,6 @@
                   </w:pPr>
                   <w:r>
                     <w:t xml:space="preserve">6.6–7.1</w:t>
-                  </w:r>
-                </w:p>
-              </w:tc>
-              <w:tc>
-                <w:tcPr/>
-                <w:p>
-                  <w:pPr>
-                    <w:pStyle w:val="Compact"/>
-                    <w:jc w:val="center"/>
-                  </w:pPr>
-                  <w:r>
-                    <w:t xml:space="preserve">multivariate</w:t>
                   </w:r>
                 </w:p>
               </w:tc>
@@ -5847,18 +5822,6 @@
                     <w:jc w:val="center"/>
                   </w:pPr>
                   <w:r>
-                    <w:t xml:space="preserve">multivariate</w:t>
-                  </w:r>
-                </w:p>
-              </w:tc>
-              <w:tc>
-                <w:tcPr/>
-                <w:p>
-                  <w:pPr>
-                    <w:pStyle w:val="Compact"/>
-                    <w:jc w:val="center"/>
-                  </w:pPr>
-                  <w:r>
                     <w:t xml:space="preserve">WC-CPP</w:t>
                   </w:r>
                 </w:p>
@@ -5942,18 +5905,6 @@
                     <w:jc w:val="center"/>
                   </w:pPr>
                   <w:r>
-                    <w:t xml:space="preserve">multivariate</w:t>
-                  </w:r>
-                </w:p>
-              </w:tc>
-              <w:tc>
-                <w:tcPr/>
-                <w:p>
-                  <w:pPr>
-                    <w:pStyle w:val="Compact"/>
-                    <w:jc w:val="center"/>
-                  </w:pPr>
-                  <w:r>
                     <w:t xml:space="preserve">WC-CPP</w:t>
                   </w:r>
                 </w:p>
@@ -6037,18 +5988,6 @@
                     <w:jc w:val="center"/>
                   </w:pPr>
                   <w:r>
-                    <w:t xml:space="preserve">multivariate</w:t>
-                  </w:r>
-                </w:p>
-              </w:tc>
-              <w:tc>
-                <w:tcPr/>
-                <w:p>
-                  <w:pPr>
-                    <w:pStyle w:val="Compact"/>
-                    <w:jc w:val="center"/>
-                  </w:pPr>
-                  <w:r>
                     <w:t xml:space="preserve">WC-CPP</w:t>
                   </w:r>
                 </w:p>
@@ -6132,18 +6071,6 @@
                     <w:jc w:val="center"/>
                   </w:pPr>
                   <w:r>
-                    <w:t xml:space="preserve">multivariate</w:t>
-                  </w:r>
-                </w:p>
-              </w:tc>
-              <w:tc>
-                <w:tcPr/>
-                <w:p>
-                  <w:pPr>
-                    <w:pStyle w:val="Compact"/>
-                    <w:jc w:val="center"/>
-                  </w:pPr>
-                  <w:r>
                     <w:t xml:space="preserve">WC-CPP</w:t>
                   </w:r>
                 </w:p>
@@ -6168,66 +6095,6 @@
                   </w:pPr>
                   <w:r>
                     <w:t xml:space="preserve">Dissolved oxygen</w:t>
-                  </w:r>
-                </w:p>
-              </w:tc>
-              <w:tc>
-                <w:tcPr/>
-                <w:p>
-                  <w:pPr>
-                    <w:pStyle w:val="Compact"/>
-                    <w:jc w:val="center"/>
-                  </w:pPr>
-                  <w:r>
-                    <w:t xml:space="preserve">% air saturation</w:t>
-                  </w:r>
-                </w:p>
-              </w:tc>
-              <w:tc>
-                <w:tcPr/>
-                <w:p>
-                  <w:pPr>
-                    <w:pStyle w:val="Compact"/>
-                    <w:jc w:val="center"/>
-                  </w:pPr>
-                  <w:r>
-                    <w:t xml:space="preserve">50</w:t>
-                  </w:r>
-                </w:p>
-              </w:tc>
-              <w:tc>
-                <w:tcPr/>
-                <w:p>
-                  <w:pPr>
-                    <w:pStyle w:val="Compact"/>
-                    <w:jc w:val="center"/>
-                  </w:pPr>
-                  <w:r>
-                    <w:t xml:space="preserve">40–60</w:t>
-                  </w:r>
-                </w:p>
-              </w:tc>
-              <w:tc>
-                <w:tcPr/>
-                <w:p>
-                  <w:pPr>
-                    <w:pStyle w:val="Compact"/>
-                    <w:jc w:val="center"/>
-                  </w:pPr>
-                  <w:r>
-                    <w:t xml:space="preserve">30–70</w:t>
-                  </w:r>
-                </w:p>
-              </w:tc>
-              <w:tc>
-                <w:tcPr/>
-                <w:p>
-                  <w:pPr>
-                    <w:pStyle w:val="Compact"/>
-                    <w:jc w:val="center"/>
-                  </w:pPr>
-                  <w:r>
-                    <w:t xml:space="preserve">univariate</w:t>
                   </w:r>
                   <w:r>
                     <w:rPr>
@@ -6245,6 +6112,54 @@
                     <w:jc w:val="center"/>
                   </w:pPr>
                   <w:r>
+                    <w:t xml:space="preserve">% air saturation</w:t>
+                  </w:r>
+                </w:p>
+              </w:tc>
+              <w:tc>
+                <w:tcPr/>
+                <w:p>
+                  <w:pPr>
+                    <w:pStyle w:val="Compact"/>
+                    <w:jc w:val="center"/>
+                  </w:pPr>
+                  <w:r>
+                    <w:t xml:space="preserve">50</w:t>
+                  </w:r>
+                </w:p>
+              </w:tc>
+              <w:tc>
+                <w:tcPr/>
+                <w:p>
+                  <w:pPr>
+                    <w:pStyle w:val="Compact"/>
+                    <w:jc w:val="center"/>
+                  </w:pPr>
+                  <w:r>
+                    <w:t xml:space="preserve">40–60</w:t>
+                  </w:r>
+                </w:p>
+              </w:tc>
+              <w:tc>
+                <w:tcPr/>
+                <w:p>
+                  <w:pPr>
+                    <w:pStyle w:val="Compact"/>
+                    <w:jc w:val="center"/>
+                  </w:pPr>
+                  <w:r>
+                    <w:t xml:space="preserve">30–70</w:t>
+                  </w:r>
+                </w:p>
+              </w:tc>
+              <w:tc>
+                <w:tcPr/>
+                <w:p>
+                  <w:pPr>
+                    <w:pStyle w:val="Compact"/>
+                    <w:jc w:val="center"/>
+                  </w:pPr>
+                  <w:r>
                     <w:t xml:space="preserve">KPP</w:t>
                   </w:r>
                 </w:p>
@@ -6269,66 +6184,6 @@
                   </w:pPr>
                   <w:r>
                     <w:t xml:space="preserve">Initial viable cell conc.</w:t>
-                  </w:r>
-                </w:p>
-              </w:tc>
-              <w:tc>
-                <w:tcPr/>
-                <w:p>
-                  <w:pPr>
-                    <w:pStyle w:val="Compact"/>
-                    <w:jc w:val="center"/>
-                  </w:pPr>
-                  <w:r>
-                    <w:t xml:space="preserve">10⁶ cells/mL</w:t>
-                  </w:r>
-                </w:p>
-              </w:tc>
-              <w:tc>
-                <w:tcPr/>
-                <w:p>
-                  <w:pPr>
-                    <w:pStyle w:val="Compact"/>
-                    <w:jc w:val="center"/>
-                  </w:pPr>
-                  <w:r>
-                    <w:t xml:space="preserve">1</w:t>
-                  </w:r>
-                </w:p>
-              </w:tc>
-              <w:tc>
-                <w:tcPr/>
-                <w:p>
-                  <w:pPr>
-                    <w:pStyle w:val="Compact"/>
-                    <w:jc w:val="center"/>
-                  </w:pPr>
-                  <w:r>
-                    <w:t xml:space="preserve">0.8–1.2</w:t>
-                  </w:r>
-                </w:p>
-              </w:tc>
-              <w:tc>
-                <w:tcPr/>
-                <w:p>
-                  <w:pPr>
-                    <w:pStyle w:val="Compact"/>
-                    <w:jc w:val="center"/>
-                  </w:pPr>
-                  <w:r>
-                    <w:t xml:space="preserve">0.5–1.5</w:t>
-                  </w:r>
-                </w:p>
-              </w:tc>
-              <w:tc>
-                <w:tcPr/>
-                <w:p>
-                  <w:pPr>
-                    <w:pStyle w:val="Compact"/>
-                    <w:jc w:val="center"/>
-                  </w:pPr>
-                  <w:r>
-                    <w:t xml:space="preserve">univariate</w:t>
                   </w:r>
                   <w:r>
                     <w:rPr>
@@ -6346,6 +6201,54 @@
                     <w:jc w:val="center"/>
                   </w:pPr>
                   <w:r>
+                    <w:t xml:space="preserve">10⁶ cells/mL</w:t>
+                  </w:r>
+                </w:p>
+              </w:tc>
+              <w:tc>
+                <w:tcPr/>
+                <w:p>
+                  <w:pPr>
+                    <w:pStyle w:val="Compact"/>
+                    <w:jc w:val="center"/>
+                  </w:pPr>
+                  <w:r>
+                    <w:t xml:space="preserve">1</w:t>
+                  </w:r>
+                </w:p>
+              </w:tc>
+              <w:tc>
+                <w:tcPr/>
+                <w:p>
+                  <w:pPr>
+                    <w:pStyle w:val="Compact"/>
+                    <w:jc w:val="center"/>
+                  </w:pPr>
+                  <w:r>
+                    <w:t xml:space="preserve">0.8–1.2</w:t>
+                  </w:r>
+                </w:p>
+              </w:tc>
+              <w:tc>
+                <w:tcPr/>
+                <w:p>
+                  <w:pPr>
+                    <w:pStyle w:val="Compact"/>
+                    <w:jc w:val="center"/>
+                  </w:pPr>
+                  <w:r>
+                    <w:t xml:space="preserve">0.5–1.5</w:t>
+                  </w:r>
+                </w:p>
+              </w:tc>
+              <w:tc>
+                <w:tcPr/>
+                <w:p>
+                  <w:pPr>
+                    <w:pStyle w:val="Compact"/>
+                    <w:jc w:val="center"/>
+                  </w:pPr>
+                  <w:r>
                     <w:t xml:space="preserve">KPP</w:t>
                   </w:r>
                 </w:p>
@@ -6370,66 +6273,6 @@
                   </w:pPr>
                   <w:r>
                     <w:t xml:space="preserve">Basal medium concentration</w:t>
-                  </w:r>
-                </w:p>
-              </w:tc>
-              <w:tc>
-                <w:tcPr/>
-                <w:p>
-                  <w:pPr>
-                    <w:pStyle w:val="Compact"/>
-                    <w:jc w:val="center"/>
-                  </w:pPr>
-                  <w:r>
-                    <w:t xml:space="preserve">× standard</w:t>
-                  </w:r>
-                </w:p>
-              </w:tc>
-              <w:tc>
-                <w:tcPr/>
-                <w:p>
-                  <w:pPr>
-                    <w:pStyle w:val="Compact"/>
-                    <w:jc w:val="center"/>
-                  </w:pPr>
-                  <w:r>
-                    <w:t xml:space="preserve">1.2</w:t>
-                  </w:r>
-                </w:p>
-              </w:tc>
-              <w:tc>
-                <w:tcPr/>
-                <w:p>
-                  <w:pPr>
-                    <w:pStyle w:val="Compact"/>
-                    <w:jc w:val="center"/>
-                  </w:pPr>
-                  <w:r>
-                    <w:t xml:space="preserve">1–1.4</w:t>
-                  </w:r>
-                </w:p>
-              </w:tc>
-              <w:tc>
-                <w:tcPr/>
-                <w:p>
-                  <w:pPr>
-                    <w:pStyle w:val="Compact"/>
-                    <w:jc w:val="center"/>
-                  </w:pPr>
-                  <w:r>
-                    <w:t xml:space="preserve">0.8–1.6</w:t>
-                  </w:r>
-                </w:p>
-              </w:tc>
-              <w:tc>
-                <w:tcPr/>
-                <w:p>
-                  <w:pPr>
-                    <w:pStyle w:val="Compact"/>
-                    <w:jc w:val="center"/>
-                  </w:pPr>
-                  <w:r>
-                    <w:t xml:space="preserve">univariate</w:t>
                   </w:r>
                   <w:r>
                     <w:rPr>
@@ -6447,6 +6290,54 @@
                     <w:jc w:val="center"/>
                   </w:pPr>
                   <w:r>
+                    <w:t xml:space="preserve">× standard</w:t>
+                  </w:r>
+                </w:p>
+              </w:tc>
+              <w:tc>
+                <w:tcPr/>
+                <w:p>
+                  <w:pPr>
+                    <w:pStyle w:val="Compact"/>
+                    <w:jc w:val="center"/>
+                  </w:pPr>
+                  <w:r>
+                    <w:t xml:space="preserve">1.2</w:t>
+                  </w:r>
+                </w:p>
+              </w:tc>
+              <w:tc>
+                <w:tcPr/>
+                <w:p>
+                  <w:pPr>
+                    <w:pStyle w:val="Compact"/>
+                    <w:jc w:val="center"/>
+                  </w:pPr>
+                  <w:r>
+                    <w:t xml:space="preserve">1–1.4</w:t>
+                  </w:r>
+                </w:p>
+              </w:tc>
+              <w:tc>
+                <w:tcPr/>
+                <w:p>
+                  <w:pPr>
+                    <w:pStyle w:val="Compact"/>
+                    <w:jc w:val="center"/>
+                  </w:pPr>
+                  <w:r>
+                    <w:t xml:space="preserve">0.8–1.6</w:t>
+                  </w:r>
+                </w:p>
+              </w:tc>
+              <w:tc>
+                <w:tcPr/>
+                <w:p>
+                  <w:pPr>
+                    <w:pStyle w:val="Compact"/>
+                    <w:jc w:val="center"/>
+                  </w:pPr>
+                  <w:r>
                     <w:t xml:space="preserve">GPP</w:t>
                   </w:r>
                 </w:p>
@@ -6471,66 +6362,6 @@
                   </w:pPr>
                   <w:r>
                     <w:t xml:space="preserve">Nutrient feed-1 volume</w:t>
-                  </w:r>
-                </w:p>
-              </w:tc>
-              <w:tc>
-                <w:tcPr/>
-                <w:p>
-                  <w:pPr>
-                    <w:pStyle w:val="Compact"/>
-                    <w:jc w:val="center"/>
-                  </w:pPr>
-                  <w:r>
-                    <w:t xml:space="preserve">% of working volume</w:t>
-                  </w:r>
-                </w:p>
-              </w:tc>
-              <w:tc>
-                <w:tcPr/>
-                <w:p>
-                  <w:pPr>
-                    <w:pStyle w:val="Compact"/>
-                    <w:jc w:val="center"/>
-                  </w:pPr>
-                  <w:r>
-                    <w:t xml:space="preserve">12</w:t>
-                  </w:r>
-                </w:p>
-              </w:tc>
-              <w:tc>
-                <w:tcPr/>
-                <w:p>
-                  <w:pPr>
-                    <w:pStyle w:val="Compact"/>
-                    <w:jc w:val="center"/>
-                  </w:pPr>
-                  <w:r>
-                    <w:t xml:space="preserve">10–14</w:t>
-                  </w:r>
-                </w:p>
-              </w:tc>
-              <w:tc>
-                <w:tcPr/>
-                <w:p>
-                  <w:pPr>
-                    <w:pStyle w:val="Compact"/>
-                    <w:jc w:val="center"/>
-                  </w:pPr>
-                  <w:r>
-                    <w:t xml:space="preserve">9–15</w:t>
-                  </w:r>
-                </w:p>
-              </w:tc>
-              <w:tc>
-                <w:tcPr/>
-                <w:p>
-                  <w:pPr>
-                    <w:pStyle w:val="Compact"/>
-                    <w:jc w:val="center"/>
-                  </w:pPr>
-                  <w:r>
-                    <w:t xml:space="preserve">univariate</w:t>
                   </w:r>
                   <w:r>
                     <w:rPr>
@@ -6548,6 +6379,54 @@
                     <w:jc w:val="center"/>
                   </w:pPr>
                   <w:r>
+                    <w:t xml:space="preserve">% of working volume</w:t>
+                  </w:r>
+                </w:p>
+              </w:tc>
+              <w:tc>
+                <w:tcPr/>
+                <w:p>
+                  <w:pPr>
+                    <w:pStyle w:val="Compact"/>
+                    <w:jc w:val="center"/>
+                  </w:pPr>
+                  <w:r>
+                    <w:t xml:space="preserve">12</w:t>
+                  </w:r>
+                </w:p>
+              </w:tc>
+              <w:tc>
+                <w:tcPr/>
+                <w:p>
+                  <w:pPr>
+                    <w:pStyle w:val="Compact"/>
+                    <w:jc w:val="center"/>
+                  </w:pPr>
+                  <w:r>
+                    <w:t xml:space="preserve">10–14</w:t>
+                  </w:r>
+                </w:p>
+              </w:tc>
+              <w:tc>
+                <w:tcPr/>
+                <w:p>
+                  <w:pPr>
+                    <w:pStyle w:val="Compact"/>
+                    <w:jc w:val="center"/>
+                  </w:pPr>
+                  <w:r>
+                    <w:t xml:space="preserve">9–15</w:t>
+                  </w:r>
+                </w:p>
+              </w:tc>
+              <w:tc>
+                <w:tcPr/>
+                <w:p>
+                  <w:pPr>
+                    <w:pStyle w:val="Compact"/>
+                    <w:jc w:val="center"/>
+                  </w:pPr>
+                  <w:r>
                     <w:t xml:space="preserve">KPP</w:t>
                   </w:r>
                 </w:p>
@@ -6577,66 +6456,6 @@
                   </w:pPr>
                   <w:r>
                     <w:t xml:space="preserve">Centrifugation (rcf)</w:t>
-                  </w:r>
-                </w:p>
-              </w:tc>
-              <w:tc>
-                <w:tcPr/>
-                <w:p>
-                  <w:pPr>
-                    <w:pStyle w:val="Compact"/>
-                    <w:jc w:val="center"/>
-                  </w:pPr>
-                  <w:r>
-                    <w:t xml:space="preserve">g</w:t>
-                  </w:r>
-                </w:p>
-              </w:tc>
-              <w:tc>
-                <w:tcPr/>
-                <w:p>
-                  <w:pPr>
-                    <w:pStyle w:val="Compact"/>
-                    <w:jc w:val="center"/>
-                  </w:pPr>
-                  <w:r>
-                    <w:t xml:space="preserve">9000</w:t>
-                  </w:r>
-                </w:p>
-              </w:tc>
-              <w:tc>
-                <w:tcPr/>
-                <w:p>
-                  <w:pPr>
-                    <w:pStyle w:val="Compact"/>
-                    <w:jc w:val="center"/>
-                  </w:pPr>
-                  <w:r>
-                    <w:t xml:space="preserve">8000–10000</w:t>
-                  </w:r>
-                </w:p>
-              </w:tc>
-              <w:tc>
-                <w:tcPr/>
-                <w:p>
-                  <w:pPr>
-                    <w:pStyle w:val="Compact"/>
-                    <w:jc w:val="center"/>
-                  </w:pPr>
-                  <w:r>
-                    <w:t xml:space="preserve">6000–12000</w:t>
-                  </w:r>
-                </w:p>
-              </w:tc>
-              <w:tc>
-                <w:tcPr/>
-                <w:p>
-                  <w:pPr>
-                    <w:pStyle w:val="Compact"/>
-                    <w:jc w:val="center"/>
-                  </w:pPr>
-                  <w:r>
-                    <w:t xml:space="preserve">univariate</w:t>
                   </w:r>
                   <w:r>
                     <w:rPr>
@@ -6654,6 +6473,54 @@
                     <w:jc w:val="center"/>
                   </w:pPr>
                   <w:r>
+                    <w:t xml:space="preserve">g</w:t>
+                  </w:r>
+                </w:p>
+              </w:tc>
+              <w:tc>
+                <w:tcPr/>
+                <w:p>
+                  <w:pPr>
+                    <w:pStyle w:val="Compact"/>
+                    <w:jc w:val="center"/>
+                  </w:pPr>
+                  <w:r>
+                    <w:t xml:space="preserve">9000</w:t>
+                  </w:r>
+                </w:p>
+              </w:tc>
+              <w:tc>
+                <w:tcPr/>
+                <w:p>
+                  <w:pPr>
+                    <w:pStyle w:val="Compact"/>
+                    <w:jc w:val="center"/>
+                  </w:pPr>
+                  <w:r>
+                    <w:t xml:space="preserve">8000–10000</w:t>
+                  </w:r>
+                </w:p>
+              </w:tc>
+              <w:tc>
+                <w:tcPr/>
+                <w:p>
+                  <w:pPr>
+                    <w:pStyle w:val="Compact"/>
+                    <w:jc w:val="center"/>
+                  </w:pPr>
+                  <w:r>
+                    <w:t xml:space="preserve">6000–12000</w:t>
+                  </w:r>
+                </w:p>
+              </w:tc>
+              <w:tc>
+                <w:tcPr/>
+                <w:p>
+                  <w:pPr>
+                    <w:pStyle w:val="Compact"/>
+                    <w:jc w:val="center"/>
+                  </w:pPr>
+                  <w:r>
                     <w:t xml:space="preserve">KPP</w:t>
                   </w:r>
                 </w:p>
@@ -6678,66 +6545,6 @@
                   </w:pPr>
                   <w:r>
                     <w:t xml:space="preserve">Depth filter load</w:t>
-                  </w:r>
-                </w:p>
-              </w:tc>
-              <w:tc>
-                <w:tcPr/>
-                <w:p>
-                  <w:pPr>
-                    <w:pStyle w:val="Compact"/>
-                    <w:jc w:val="center"/>
-                  </w:pPr>
-                  <w:r>
-                    <w:t xml:space="preserve">L/m2</w:t>
-                  </w:r>
-                </w:p>
-              </w:tc>
-              <w:tc>
-                <w:tcPr/>
-                <w:p>
-                  <w:pPr>
-                    <w:pStyle w:val="Compact"/>
-                    <w:jc w:val="center"/>
-                  </w:pPr>
-                  <w:r>
-                    <w:t xml:space="preserve">120</w:t>
-                  </w:r>
-                </w:p>
-              </w:tc>
-              <w:tc>
-                <w:tcPr/>
-                <w:p>
-                  <w:pPr>
-                    <w:pStyle w:val="Compact"/>
-                    <w:jc w:val="center"/>
-                  </w:pPr>
-                  <w:r>
-                    <w:t xml:space="preserve">100–140</w:t>
-                  </w:r>
-                </w:p>
-              </w:tc>
-              <w:tc>
-                <w:tcPr/>
-                <w:p>
-                  <w:pPr>
-                    <w:pStyle w:val="Compact"/>
-                    <w:jc w:val="center"/>
-                  </w:pPr>
-                  <w:r>
-                    <w:t xml:space="preserve">80–160</w:t>
-                  </w:r>
-                </w:p>
-              </w:tc>
-              <w:tc>
-                <w:tcPr/>
-                <w:p>
-                  <w:pPr>
-                    <w:pStyle w:val="Compact"/>
-                    <w:jc w:val="center"/>
-                  </w:pPr>
-                  <w:r>
-                    <w:t xml:space="preserve">univariate</w:t>
                   </w:r>
                   <w:r>
                     <w:rPr>
@@ -6755,6 +6562,54 @@
                     <w:jc w:val="center"/>
                   </w:pPr>
                   <w:r>
+                    <w:t xml:space="preserve">L/m2</w:t>
+                  </w:r>
+                </w:p>
+              </w:tc>
+              <w:tc>
+                <w:tcPr/>
+                <w:p>
+                  <w:pPr>
+                    <w:pStyle w:val="Compact"/>
+                    <w:jc w:val="center"/>
+                  </w:pPr>
+                  <w:r>
+                    <w:t xml:space="preserve">120</w:t>
+                  </w:r>
+                </w:p>
+              </w:tc>
+              <w:tc>
+                <w:tcPr/>
+                <w:p>
+                  <w:pPr>
+                    <w:pStyle w:val="Compact"/>
+                    <w:jc w:val="center"/>
+                  </w:pPr>
+                  <w:r>
+                    <w:t xml:space="preserve">100–140</w:t>
+                  </w:r>
+                </w:p>
+              </w:tc>
+              <w:tc>
+                <w:tcPr/>
+                <w:p>
+                  <w:pPr>
+                    <w:pStyle w:val="Compact"/>
+                    <w:jc w:val="center"/>
+                  </w:pPr>
+                  <w:r>
+                    <w:t xml:space="preserve">80–160</w:t>
+                  </w:r>
+                </w:p>
+              </w:tc>
+              <w:tc>
+                <w:tcPr/>
+                <w:p>
+                  <w:pPr>
+                    <w:pStyle w:val="Compact"/>
+                    <w:jc w:val="center"/>
+                  </w:pPr>
+                  <w:r>
                     <w:t xml:space="preserve">KPP</w:t>
                   </w:r>
                 </w:p>
@@ -6779,66 +6634,6 @@
                   </w:pPr>
                   <w:r>
                     <w:t xml:space="preserve">Post-clarification turbidity</w:t>
-                  </w:r>
-                </w:p>
-              </w:tc>
-              <w:tc>
-                <w:tcPr/>
-                <w:p>
-                  <w:pPr>
-                    <w:pStyle w:val="Compact"/>
-                    <w:jc w:val="center"/>
-                  </w:pPr>
-                  <w:r>
-                    <w:t xml:space="preserve">NTU</w:t>
-                  </w:r>
-                </w:p>
-              </w:tc>
-              <w:tc>
-                <w:tcPr/>
-                <w:p>
-                  <w:pPr>
-                    <w:pStyle w:val="Compact"/>
-                    <w:jc w:val="center"/>
-                  </w:pPr>
-                  <w:r>
-                    <w:t xml:space="preserve">5</w:t>
-                  </w:r>
-                </w:p>
-              </w:tc>
-              <w:tc>
-                <w:tcPr/>
-                <w:p>
-                  <w:pPr>
-                    <w:pStyle w:val="Compact"/>
-                    <w:jc w:val="center"/>
-                  </w:pPr>
-                  <w:r>
-                    <w:t xml:space="preserve">1–10</w:t>
-                  </w:r>
-                </w:p>
-              </w:tc>
-              <w:tc>
-                <w:tcPr/>
-                <w:p>
-                  <w:pPr>
-                    <w:pStyle w:val="Compact"/>
-                    <w:jc w:val="center"/>
-                  </w:pPr>
-                  <w:r>
-                    <w:t xml:space="preserve">1–20</w:t>
-                  </w:r>
-                </w:p>
-              </w:tc>
-              <w:tc>
-                <w:tcPr/>
-                <w:p>
-                  <w:pPr>
-                    <w:pStyle w:val="Compact"/>
-                    <w:jc w:val="center"/>
-                  </w:pPr>
-                  <w:r>
-                    <w:t xml:space="preserve">univariate</w:t>
                   </w:r>
                   <w:r>
                     <w:rPr>
@@ -6856,6 +6651,54 @@
                     <w:jc w:val="center"/>
                   </w:pPr>
                   <w:r>
+                    <w:t xml:space="preserve">NTU</w:t>
+                  </w:r>
+                </w:p>
+              </w:tc>
+              <w:tc>
+                <w:tcPr/>
+                <w:p>
+                  <w:pPr>
+                    <w:pStyle w:val="Compact"/>
+                    <w:jc w:val="center"/>
+                  </w:pPr>
+                  <w:r>
+                    <w:t xml:space="preserve">5</w:t>
+                  </w:r>
+                </w:p>
+              </w:tc>
+              <w:tc>
+                <w:tcPr/>
+                <w:p>
+                  <w:pPr>
+                    <w:pStyle w:val="Compact"/>
+                    <w:jc w:val="center"/>
+                  </w:pPr>
+                  <w:r>
+                    <w:t xml:space="preserve">1–10</w:t>
+                  </w:r>
+                </w:p>
+              </w:tc>
+              <w:tc>
+                <w:tcPr/>
+                <w:p>
+                  <w:pPr>
+                    <w:pStyle w:val="Compact"/>
+                    <w:jc w:val="center"/>
+                  </w:pPr>
+                  <w:r>
+                    <w:t xml:space="preserve">1–20</w:t>
+                  </w:r>
+                </w:p>
+              </w:tc>
+              <w:tc>
+                <w:tcPr/>
+                <w:p>
+                  <w:pPr>
+                    <w:pStyle w:val="Compact"/>
+                    <w:jc w:val="center"/>
+                  </w:pPr>
+                  <w:r>
                     <w:t xml:space="preserve">GPP</w:t>
                   </w:r>
                 </w:p>
@@ -6950,18 +6793,6 @@
                     <w:jc w:val="center"/>
                   </w:pPr>
                   <w:r>
-                    <w:t xml:space="preserve">multivariate</w:t>
-                  </w:r>
-                </w:p>
-              </w:tc>
-              <w:tc>
-                <w:tcPr/>
-                <w:p>
-                  <w:pPr>
-                    <w:pStyle w:val="Compact"/>
-                    <w:jc w:val="center"/>
-                  </w:pPr>
-                  <w:r>
                     <w:t xml:space="preserve">WC-CPP</w:t>
                   </w:r>
                 </w:p>
@@ -7045,18 +6876,6 @@
                     <w:jc w:val="center"/>
                   </w:pPr>
                   <w:r>
-                    <w:t xml:space="preserve">multivariate</w:t>
-                  </w:r>
-                </w:p>
-              </w:tc>
-              <w:tc>
-                <w:tcPr/>
-                <w:p>
-                  <w:pPr>
-                    <w:pStyle w:val="Compact"/>
-                    <w:jc w:val="center"/>
-                  </w:pPr>
-                  <w:r>
                     <w:t xml:space="preserve">WC-CPP</w:t>
                   </w:r>
                 </w:p>
@@ -7140,18 +6959,6 @@
                     <w:jc w:val="center"/>
                   </w:pPr>
                   <w:r>
-                    <w:t xml:space="preserve">multivariate</w:t>
-                  </w:r>
-                </w:p>
-              </w:tc>
-              <w:tc>
-                <w:tcPr/>
-                <w:p>
-                  <w:pPr>
-                    <w:pStyle w:val="Compact"/>
-                    <w:jc w:val="center"/>
-                  </w:pPr>
-                  <w:r>
                     <w:t xml:space="preserve">KPP</w:t>
                   </w:r>
                 </w:p>
@@ -7235,18 +7042,6 @@
                     <w:jc w:val="center"/>
                   </w:pPr>
                   <w:r>
-                    <w:t xml:space="preserve">multivariate</w:t>
-                  </w:r>
-                </w:p>
-              </w:tc>
-              <w:tc>
-                <w:tcPr/>
-                <w:p>
-                  <w:pPr>
-                    <w:pStyle w:val="Compact"/>
-                    <w:jc w:val="center"/>
-                  </w:pPr>
-                  <w:r>
                     <w:t xml:space="preserve">KPP</w:t>
                   </w:r>
                 </w:p>
@@ -7271,66 +7066,6 @@
                   </w:pPr>
                   <w:r>
                     <w:t xml:space="preserve">Operating temperature</w:t>
-                  </w:r>
-                </w:p>
-              </w:tc>
-              <w:tc>
-                <w:tcPr/>
-                <w:p>
-                  <w:pPr>
-                    <w:pStyle w:val="Compact"/>
-                    <w:jc w:val="center"/>
-                  </w:pPr>
-                  <w:r>
-                    <w:t xml:space="preserve">°C</w:t>
-                  </w:r>
-                </w:p>
-              </w:tc>
-              <w:tc>
-                <w:tcPr/>
-                <w:p>
-                  <w:pPr>
-                    <w:pStyle w:val="Compact"/>
-                    <w:jc w:val="center"/>
-                  </w:pPr>
-                  <w:r>
-                    <w:t xml:space="preserve">22</w:t>
-                  </w:r>
-                </w:p>
-              </w:tc>
-              <w:tc>
-                <w:tcPr/>
-                <w:p>
-                  <w:pPr>
-                    <w:pStyle w:val="Compact"/>
-                    <w:jc w:val="center"/>
-                  </w:pPr>
-                  <w:r>
-                    <w:t xml:space="preserve">18–26</w:t>
-                  </w:r>
-                </w:p>
-              </w:tc>
-              <w:tc>
-                <w:tcPr/>
-                <w:p>
-                  <w:pPr>
-                    <w:pStyle w:val="Compact"/>
-                    <w:jc w:val="center"/>
-                  </w:pPr>
-                  <w:r>
-                    <w:t xml:space="preserve">15–30</w:t>
-                  </w:r>
-                </w:p>
-              </w:tc>
-              <w:tc>
-                <w:tcPr/>
-                <w:p>
-                  <w:pPr>
-                    <w:pStyle w:val="Compact"/>
-                    <w:jc w:val="center"/>
-                  </w:pPr>
-                  <w:r>
-                    <w:t xml:space="preserve">univariate</w:t>
                   </w:r>
                   <w:r>
                     <w:rPr>
@@ -7348,6 +7083,54 @@
                     <w:jc w:val="center"/>
                   </w:pPr>
                   <w:r>
+                    <w:t xml:space="preserve">°C</w:t>
+                  </w:r>
+                </w:p>
+              </w:tc>
+              <w:tc>
+                <w:tcPr/>
+                <w:p>
+                  <w:pPr>
+                    <w:pStyle w:val="Compact"/>
+                    <w:jc w:val="center"/>
+                  </w:pPr>
+                  <w:r>
+                    <w:t xml:space="preserve">22</w:t>
+                  </w:r>
+                </w:p>
+              </w:tc>
+              <w:tc>
+                <w:tcPr/>
+                <w:p>
+                  <w:pPr>
+                    <w:pStyle w:val="Compact"/>
+                    <w:jc w:val="center"/>
+                  </w:pPr>
+                  <w:r>
+                    <w:t xml:space="preserve">18–26</w:t>
+                  </w:r>
+                </w:p>
+              </w:tc>
+              <w:tc>
+                <w:tcPr/>
+                <w:p>
+                  <w:pPr>
+                    <w:pStyle w:val="Compact"/>
+                    <w:jc w:val="center"/>
+                  </w:pPr>
+                  <w:r>
+                    <w:t xml:space="preserve">15–30</w:t>
+                  </w:r>
+                </w:p>
+              </w:tc>
+              <w:tc>
+                <w:tcPr/>
+                <w:p>
+                  <w:pPr>
+                    <w:pStyle w:val="Compact"/>
+                    <w:jc w:val="center"/>
+                  </w:pPr>
+                  <w:r>
                     <w:t xml:space="preserve">GPP</w:t>
                   </w:r>
                 </w:p>
@@ -7372,66 +7155,6 @@
                   </w:pPr>
                   <w:r>
                     <w:t xml:space="preserve">Bed height</w:t>
-                  </w:r>
-                </w:p>
-              </w:tc>
-              <w:tc>
-                <w:tcPr/>
-                <w:p>
-                  <w:pPr>
-                    <w:pStyle w:val="Compact"/>
-                    <w:jc w:val="center"/>
-                  </w:pPr>
-                  <w:r>
-                    <w:t xml:space="preserve">cm</w:t>
-                  </w:r>
-                </w:p>
-              </w:tc>
-              <w:tc>
-                <w:tcPr/>
-                <w:p>
-                  <w:pPr>
-                    <w:pStyle w:val="Compact"/>
-                    <w:jc w:val="center"/>
-                  </w:pPr>
-                  <w:r>
-                    <w:t xml:space="preserve">20</w:t>
-                  </w:r>
-                </w:p>
-              </w:tc>
-              <w:tc>
-                <w:tcPr/>
-                <w:p>
-                  <w:pPr>
-                    <w:pStyle w:val="Compact"/>
-                    <w:jc w:val="center"/>
-                  </w:pPr>
-                  <w:r>
-                    <w:t xml:space="preserve">15–25</w:t>
-                  </w:r>
-                </w:p>
-              </w:tc>
-              <w:tc>
-                <w:tcPr/>
-                <w:p>
-                  <w:pPr>
-                    <w:pStyle w:val="Compact"/>
-                    <w:jc w:val="center"/>
-                  </w:pPr>
-                  <w:r>
-                    <w:t xml:space="preserve">10–30</w:t>
-                  </w:r>
-                </w:p>
-              </w:tc>
-              <w:tc>
-                <w:tcPr/>
-                <w:p>
-                  <w:pPr>
-                    <w:pStyle w:val="Compact"/>
-                    <w:jc w:val="center"/>
-                  </w:pPr>
-                  <w:r>
-                    <w:t xml:space="preserve">univariate</w:t>
                   </w:r>
                   <w:r>
                     <w:rPr>
@@ -7449,6 +7172,54 @@
                     <w:jc w:val="center"/>
                   </w:pPr>
                   <w:r>
+                    <w:t xml:space="preserve">cm</w:t>
+                  </w:r>
+                </w:p>
+              </w:tc>
+              <w:tc>
+                <w:tcPr/>
+                <w:p>
+                  <w:pPr>
+                    <w:pStyle w:val="Compact"/>
+                    <w:jc w:val="center"/>
+                  </w:pPr>
+                  <w:r>
+                    <w:t xml:space="preserve">20</w:t>
+                  </w:r>
+                </w:p>
+              </w:tc>
+              <w:tc>
+                <w:tcPr/>
+                <w:p>
+                  <w:pPr>
+                    <w:pStyle w:val="Compact"/>
+                    <w:jc w:val="center"/>
+                  </w:pPr>
+                  <w:r>
+                    <w:t xml:space="preserve">15–25</w:t>
+                  </w:r>
+                </w:p>
+              </w:tc>
+              <w:tc>
+                <w:tcPr/>
+                <w:p>
+                  <w:pPr>
+                    <w:pStyle w:val="Compact"/>
+                    <w:jc w:val="center"/>
+                  </w:pPr>
+                  <w:r>
+                    <w:t xml:space="preserve">10–30</w:t>
+                  </w:r>
+                </w:p>
+              </w:tc>
+              <w:tc>
+                <w:tcPr/>
+                <w:p>
+                  <w:pPr>
+                    <w:pStyle w:val="Compact"/>
+                    <w:jc w:val="center"/>
+                  </w:pPr>
+                  <w:r>
                     <w:t xml:space="preserve">GPP</w:t>
                   </w:r>
                 </w:p>
@@ -7549,18 +7320,6 @@
                     <w:jc w:val="center"/>
                   </w:pPr>
                   <w:r>
-                    <w:t xml:space="preserve">multivariate</w:t>
-                  </w:r>
-                </w:p>
-              </w:tc>
-              <w:tc>
-                <w:tcPr/>
-                <w:p>
-                  <w:pPr>
-                    <w:pStyle w:val="Compact"/>
-                    <w:jc w:val="center"/>
-                  </w:pPr>
-                  <w:r>
                     <w:t xml:space="preserve">CPP</w:t>
                   </w:r>
                 </w:p>
@@ -7656,18 +7415,6 @@
                     <w:jc w:val="center"/>
                   </w:pPr>
                   <w:r>
-                    <w:t xml:space="preserve">multivariate</w:t>
-                  </w:r>
-                </w:p>
-              </w:tc>
-              <w:tc>
-                <w:tcPr/>
-                <w:p>
-                  <w:pPr>
-                    <w:pStyle w:val="Compact"/>
-                    <w:jc w:val="center"/>
-                  </w:pPr>
-                  <w:r>
                     <w:t xml:space="preserve">WC-CPP</w:t>
                   </w:r>
                 </w:p>
@@ -7757,18 +7504,6 @@
                     <w:jc w:val="center"/>
                   </w:pPr>
                   <w:r>
-                    <w:t xml:space="preserve">multivariate</w:t>
-                  </w:r>
-                </w:p>
-              </w:tc>
-              <w:tc>
-                <w:tcPr/>
-                <w:p>
-                  <w:pPr>
-                    <w:pStyle w:val="Compact"/>
-                    <w:jc w:val="center"/>
-                  </w:pPr>
-                  <w:r>
                     <w:t xml:space="preserve">WC-CPP</w:t>
                   </w:r>
                 </w:p>
@@ -7793,6 +7528,12 @@
                   </w:pPr>
                   <w:r>
                     <w:t xml:space="preserve">A-Mab concentration</w:t>
+                  </w:r>
+                  <w:r>
+                    <w:rPr>
+                      <w:vertAlign w:val="superscript"/>
+                    </w:rPr>
+                    <w:t xml:space="preserve">a)</w:t>
                   </w:r>
                 </w:p>
               </w:tc>
@@ -7858,7 +7599,367 @@
                     <w:jc w:val="center"/>
                   </w:pPr>
                   <w:r>
-                    <w:t xml:space="preserve">univariate</w:t>
+                    <w:t xml:space="preserve">GPP</w:t>
+                  </w:r>
+                </w:p>
+              </w:tc>
+            </w:tr>
+            <w:tr>
+              <w:tc>
+                <w:tcPr>
+                  <w:vMerge w:val="restart"/>
+                </w:tcPr>
+                <w:p>
+                  <w:pPr>
+                    <w:pStyle w:val="Compact"/>
+                    <w:jc w:val="center"/>
+                  </w:pPr>
+                  <w:r>
+                    <w:t xml:space="preserve">Cation exchange</w:t>
+                  </w:r>
+                </w:p>
+              </w:tc>
+              <w:tc>
+                <w:tcPr/>
+                <w:p>
+                  <w:pPr>
+                    <w:pStyle w:val="Compact"/>
+                    <w:jc w:val="center"/>
+                  </w:pPr>
+                  <w:r>
+                    <w:t xml:space="preserve">Protein load</w:t>
+                  </w:r>
+                </w:p>
+              </w:tc>
+              <w:tc>
+                <w:tcPr/>
+                <w:p>
+                  <w:pPr>
+                    <w:pStyle w:val="Compact"/>
+                    <w:jc w:val="center"/>
+                  </w:pPr>
+                  <w:r>
+                    <w:t xml:space="preserve">g/L resin</w:t>
+                  </w:r>
+                </w:p>
+              </w:tc>
+              <w:tc>
+                <w:tcPr/>
+                <w:p>
+                  <w:pPr>
+                    <w:pStyle w:val="Compact"/>
+                    <w:jc w:val="center"/>
+                  </w:pPr>
+                  <w:r>
+                    <w:t xml:space="preserve">25</w:t>
+                  </w:r>
+                </w:p>
+              </w:tc>
+              <w:tc>
+                <w:tcPr/>
+                <w:p>
+                  <w:pPr>
+                    <w:pStyle w:val="Compact"/>
+                    <w:jc w:val="center"/>
+                  </w:pPr>
+                  <w:r>
+                    <w:t xml:space="preserve">18–32</w:t>
+                  </w:r>
+                </w:p>
+              </w:tc>
+              <w:tc>
+                <w:tcPr/>
+                <w:p>
+                  <w:pPr>
+                    <w:pStyle w:val="Compact"/>
+                    <w:jc w:val="center"/>
+                  </w:pPr>
+                  <w:r>
+                    <w:t xml:space="preserve">10–40</w:t>
+                  </w:r>
+                </w:p>
+              </w:tc>
+              <w:tc>
+                <w:tcPr/>
+                <w:p>
+                  <w:pPr>
+                    <w:pStyle w:val="Compact"/>
+                    <w:jc w:val="center"/>
+                  </w:pPr>
+                  <w:r>
+                    <w:t xml:space="preserve">WC-CPP</w:t>
+                  </w:r>
+                </w:p>
+              </w:tc>
+            </w:tr>
+            <w:tr>
+              <w:tc>
+                <w:tcPr>
+                  <w:gridSpan w:val="1"/>
+                  <w:vMerge w:val="continue"/>
+                </w:tcPr>
+                <w:p>
+                  <w:pPr/>
+                </w:p>
+              </w:tc>
+              <w:tc>
+                <w:tcPr/>
+                <w:p>
+                  <w:pPr>
+                    <w:pStyle w:val="Compact"/>
+                    <w:jc w:val="center"/>
+                  </w:pPr>
+                  <w:r>
+                    <w:t xml:space="preserve">Load/Wash conductivity</w:t>
+                  </w:r>
+                </w:p>
+              </w:tc>
+              <w:tc>
+                <w:tcPr/>
+                <w:p>
+                  <w:pPr>
+                    <w:pStyle w:val="Compact"/>
+                    <w:jc w:val="center"/>
+                  </w:pPr>
+                  <w:r>
+                    <w:t xml:space="preserve">mS/cm</w:t>
+                  </w:r>
+                </w:p>
+              </w:tc>
+              <w:tc>
+                <w:tcPr/>
+                <w:p>
+                  <w:pPr>
+                    <w:pStyle w:val="Compact"/>
+                    <w:jc w:val="center"/>
+                  </w:pPr>
+                  <w:r>
+                    <w:t xml:space="preserve">5</w:t>
+                  </w:r>
+                </w:p>
+              </w:tc>
+              <w:tc>
+                <w:tcPr/>
+                <w:p>
+                  <w:pPr>
+                    <w:pStyle w:val="Compact"/>
+                    <w:jc w:val="center"/>
+                  </w:pPr>
+                  <w:r>
+                    <w:t xml:space="preserve">4–6</w:t>
+                  </w:r>
+                </w:p>
+              </w:tc>
+              <w:tc>
+                <w:tcPr/>
+                <w:p>
+                  <w:pPr>
+                    <w:pStyle w:val="Compact"/>
+                    <w:jc w:val="center"/>
+                  </w:pPr>
+                  <w:r>
+                    <w:t xml:space="preserve">3–7</w:t>
+                  </w:r>
+                </w:p>
+              </w:tc>
+              <w:tc>
+                <w:tcPr/>
+                <w:p>
+                  <w:pPr>
+                    <w:pStyle w:val="Compact"/>
+                    <w:jc w:val="center"/>
+                  </w:pPr>
+                  <w:r>
+                    <w:t xml:space="preserve">WC-CPP</w:t>
+                  </w:r>
+                </w:p>
+              </w:tc>
+            </w:tr>
+            <w:tr>
+              <w:tc>
+                <w:tcPr>
+                  <w:gridSpan w:val="1"/>
+                  <w:vMerge w:val="continue"/>
+                </w:tcPr>
+                <w:p>
+                  <w:pPr/>
+                </w:p>
+              </w:tc>
+              <w:tc>
+                <w:tcPr/>
+                <w:p>
+                  <w:pPr>
+                    <w:pStyle w:val="Compact"/>
+                    <w:jc w:val="center"/>
+                  </w:pPr>
+                  <w:r>
+                    <w:t xml:space="preserve">Elution buffer pH</w:t>
+                  </w:r>
+                </w:p>
+              </w:tc>
+              <w:tc>
+                <w:tcPr/>
+                <w:p>
+                  <w:pPr>
+                    <w:pStyle w:val="Compact"/>
+                    <w:jc w:val="center"/>
+                  </w:pPr>
+                  <w:r>
+                    <w:t xml:space="preserve">pH</w:t>
+                  </w:r>
+                </w:p>
+              </w:tc>
+              <w:tc>
+                <w:tcPr/>
+                <w:p>
+                  <w:pPr>
+                    <w:pStyle w:val="Compact"/>
+                    <w:jc w:val="center"/>
+                  </w:pPr>
+                  <w:r>
+                    <w:t xml:space="preserve">6</w:t>
+                  </w:r>
+                </w:p>
+              </w:tc>
+              <w:tc>
+                <w:tcPr/>
+                <w:p>
+                  <w:pPr>
+                    <w:pStyle w:val="Compact"/>
+                    <w:jc w:val="center"/>
+                  </w:pPr>
+                  <w:r>
+                    <w:t xml:space="preserve">5.85–6.15</w:t>
+                  </w:r>
+                </w:p>
+              </w:tc>
+              <w:tc>
+                <w:tcPr/>
+                <w:p>
+                  <w:pPr>
+                    <w:pStyle w:val="Compact"/>
+                    <w:jc w:val="center"/>
+                  </w:pPr>
+                  <w:r>
+                    <w:t xml:space="preserve">5.8–6.2</w:t>
+                  </w:r>
+                </w:p>
+              </w:tc>
+              <w:tc>
+                <w:tcPr/>
+                <w:p>
+                  <w:pPr>
+                    <w:pStyle w:val="Compact"/>
+                    <w:jc w:val="center"/>
+                  </w:pPr>
+                  <w:r>
+                    <w:t xml:space="preserve">WC-CPP</w:t>
+                  </w:r>
+                </w:p>
+              </w:tc>
+            </w:tr>
+            <w:tr>
+              <w:tc>
+                <w:tcPr>
+                  <w:gridSpan w:val="1"/>
+                  <w:vMerge w:val="continue"/>
+                </w:tcPr>
+                <w:p>
+                  <w:pPr/>
+                </w:p>
+              </w:tc>
+              <w:tc>
+                <w:tcPr/>
+                <w:p>
+                  <w:pPr>
+                    <w:pStyle w:val="Compact"/>
+                    <w:jc w:val="center"/>
+                  </w:pPr>
+                  <w:r>
+                    <w:t xml:space="preserve">Elution stop collect</w:t>
+                  </w:r>
+                </w:p>
+              </w:tc>
+              <w:tc>
+                <w:tcPr/>
+                <w:p>
+                  <w:pPr>
+                    <w:pStyle w:val="Compact"/>
+                    <w:jc w:val="center"/>
+                  </w:pPr>
+                  <w:r>
+                    <w:t xml:space="preserve">AU (OD280, descending)</w:t>
+                  </w:r>
+                </w:p>
+              </w:tc>
+              <w:tc>
+                <w:tcPr/>
+                <w:p>
+                  <w:pPr>
+                    <w:pStyle w:val="Compact"/>
+                    <w:jc w:val="center"/>
+                  </w:pPr>
+                  <w:r>
+                    <w:t xml:space="preserve">1</w:t>
+                  </w:r>
+                </w:p>
+              </w:tc>
+              <w:tc>
+                <w:tcPr/>
+                <w:p>
+                  <w:pPr>
+                    <w:pStyle w:val="Compact"/>
+                    <w:jc w:val="center"/>
+                  </w:pPr>
+                  <w:r>
+                    <w:t xml:space="preserve">0.7–1.3</w:t>
+                  </w:r>
+                </w:p>
+              </w:tc>
+              <w:tc>
+                <w:tcPr/>
+                <w:p>
+                  <w:pPr>
+                    <w:pStyle w:val="Compact"/>
+                    <w:jc w:val="center"/>
+                  </w:pPr>
+                  <w:r>
+                    <w:t xml:space="preserve">0.5–1.5</w:t>
+                  </w:r>
+                </w:p>
+              </w:tc>
+              <w:tc>
+                <w:tcPr/>
+                <w:p>
+                  <w:pPr>
+                    <w:pStyle w:val="Compact"/>
+                    <w:jc w:val="center"/>
+                  </w:pPr>
+                  <w:r>
+                    <w:t xml:space="preserve">WC-CPP</w:t>
+                  </w:r>
+                </w:p>
+              </w:tc>
+            </w:tr>
+            <w:tr>
+              <w:tc>
+                <w:tcPr>
+                  <w:gridSpan w:val="1"/>
+                  <w:vMerge w:val="continue"/>
+                </w:tcPr>
+                <w:p>
+                  <w:pPr/>
+                </w:p>
+              </w:tc>
+              <w:tc>
+                <w:tcPr/>
+                <w:p>
+                  <w:pPr>
+                    <w:pStyle w:val="Compact"/>
+                    <w:jc w:val="center"/>
+                  </w:pPr>
+                  <w:r>
+                    <w:t xml:space="preserve">Elution flow rate</w:t>
                   </w:r>
                   <w:r>
                     <w:rPr>
@@ -7876,6 +7977,54 @@
                     <w:jc w:val="center"/>
                   </w:pPr>
                   <w:r>
+                    <w:t xml:space="preserve">cm/hr</w:t>
+                  </w:r>
+                </w:p>
+              </w:tc>
+              <w:tc>
+                <w:tcPr/>
+                <w:p>
+                  <w:pPr>
+                    <w:pStyle w:val="Compact"/>
+                    <w:jc w:val="center"/>
+                  </w:pPr>
+                  <w:r>
+                    <w:t xml:space="preserve">200</w:t>
+                  </w:r>
+                </w:p>
+              </w:tc>
+              <w:tc>
+                <w:tcPr/>
+                <w:p>
+                  <w:pPr>
+                    <w:pStyle w:val="Compact"/>
+                    <w:jc w:val="center"/>
+                  </w:pPr>
+                  <w:r>
+                    <w:t xml:space="preserve">150–250</w:t>
+                  </w:r>
+                </w:p>
+              </w:tc>
+              <w:tc>
+                <w:tcPr/>
+                <w:p>
+                  <w:pPr>
+                    <w:pStyle w:val="Compact"/>
+                    <w:jc w:val="center"/>
+                  </w:pPr>
+                  <w:r>
+                    <w:t xml:space="preserve">100–300</w:t>
+                  </w:r>
+                </w:p>
+              </w:tc>
+              <w:tc>
+                <w:tcPr/>
+                <w:p>
+                  <w:pPr>
+                    <w:pStyle w:val="Compact"/>
+                    <w:jc w:val="center"/>
+                  </w:pPr>
+                  <w:r>
                     <w:t xml:space="preserve">GPP</w:t>
                   </w:r>
                 </w:p>
@@ -7892,79 +8041,67 @@
                     <w:jc w:val="center"/>
                   </w:pPr>
                   <w:r>
-                    <w:t xml:space="preserve">Cation exchange</w:t>
-                  </w:r>
-                </w:p>
-              </w:tc>
-              <w:tc>
-                <w:tcPr/>
-                <w:p>
-                  <w:pPr>
-                    <w:pStyle w:val="Compact"/>
-                    <w:jc w:val="center"/>
-                  </w:pPr>
-                  <w:r>
-                    <w:t xml:space="preserve">Protein load</w:t>
-                  </w:r>
-                </w:p>
-              </w:tc>
-              <w:tc>
-                <w:tcPr/>
-                <w:p>
-                  <w:pPr>
-                    <w:pStyle w:val="Compact"/>
-                    <w:jc w:val="center"/>
-                  </w:pPr>
-                  <w:r>
-                    <w:t xml:space="preserve">g/L resin</w:t>
-                  </w:r>
-                </w:p>
-              </w:tc>
-              <w:tc>
-                <w:tcPr/>
-                <w:p>
-                  <w:pPr>
-                    <w:pStyle w:val="Compact"/>
-                    <w:jc w:val="center"/>
-                  </w:pPr>
-                  <w:r>
-                    <w:t xml:space="preserve">25</w:t>
-                  </w:r>
-                </w:p>
-              </w:tc>
-              <w:tc>
-                <w:tcPr/>
-                <w:p>
-                  <w:pPr>
-                    <w:pStyle w:val="Compact"/>
-                    <w:jc w:val="center"/>
-                  </w:pPr>
-                  <w:r>
-                    <w:t xml:space="preserve">18–32</w:t>
-                  </w:r>
-                </w:p>
-              </w:tc>
-              <w:tc>
-                <w:tcPr/>
-                <w:p>
-                  <w:pPr>
-                    <w:pStyle w:val="Compact"/>
-                    <w:jc w:val="center"/>
-                  </w:pPr>
-                  <w:r>
-                    <w:t xml:space="preserve">10–40</w:t>
-                  </w:r>
-                </w:p>
-              </w:tc>
-              <w:tc>
-                <w:tcPr/>
-                <w:p>
-                  <w:pPr>
-                    <w:pStyle w:val="Compact"/>
-                    <w:jc w:val="center"/>
-                  </w:pPr>
-                  <w:r>
-                    <w:t xml:space="preserve">multivariate</w:t>
+                    <w:t xml:space="preserve">Anion exchange</w:t>
+                  </w:r>
+                </w:p>
+              </w:tc>
+              <w:tc>
+                <w:tcPr/>
+                <w:p>
+                  <w:pPr>
+                    <w:pStyle w:val="Compact"/>
+                    <w:jc w:val="center"/>
+                  </w:pPr>
+                  <w:r>
+                    <w:t xml:space="preserve">Load pH</w:t>
+                  </w:r>
+                </w:p>
+              </w:tc>
+              <w:tc>
+                <w:tcPr/>
+                <w:p>
+                  <w:pPr>
+                    <w:pStyle w:val="Compact"/>
+                    <w:jc w:val="center"/>
+                  </w:pPr>
+                  <w:r>
+                    <w:t xml:space="preserve">pH</w:t>
+                  </w:r>
+                </w:p>
+              </w:tc>
+              <w:tc>
+                <w:tcPr/>
+                <w:p>
+                  <w:pPr>
+                    <w:pStyle w:val="Compact"/>
+                    <w:jc w:val="center"/>
+                  </w:pPr>
+                  <w:r>
+                    <w:t xml:space="preserve">7.5</w:t>
+                  </w:r>
+                </w:p>
+              </w:tc>
+              <w:tc>
+                <w:tcPr/>
+                <w:p>
+                  <w:pPr>
+                    <w:pStyle w:val="Compact"/>
+                    <w:jc w:val="center"/>
+                  </w:pPr>
+                  <w:r>
+                    <w:t xml:space="preserve">7.35–7.65</w:t>
+                  </w:r>
+                </w:p>
+              </w:tc>
+              <w:tc>
+                <w:tcPr/>
+                <w:p>
+                  <w:pPr>
+                    <w:pStyle w:val="Compact"/>
+                    <w:jc w:val="center"/>
+                  </w:pPr>
+                  <w:r>
+                    <w:t xml:space="preserve">7.2–7.8</w:t>
                   </w:r>
                 </w:p>
               </w:tc>
@@ -7999,7 +8136,7 @@
                     <w:jc w:val="center"/>
                   </w:pPr>
                   <w:r>
-                    <w:t xml:space="preserve">Load/Wash conductivity</w:t>
+                    <w:t xml:space="preserve">Equil/Wash-1 conductivity</w:t>
                   </w:r>
                 </w:p>
               </w:tc>
@@ -8023,43 +8160,31 @@
                     <w:jc w:val="center"/>
                   </w:pPr>
                   <w:r>
-                    <w:t xml:space="preserve">5</w:t>
-                  </w:r>
-                </w:p>
-              </w:tc>
-              <w:tc>
-                <w:tcPr/>
-                <w:p>
-                  <w:pPr>
-                    <w:pStyle w:val="Compact"/>
-                    <w:jc w:val="center"/>
-                  </w:pPr>
-                  <w:r>
-                    <w:t xml:space="preserve">4–6</w:t>
-                  </w:r>
-                </w:p>
-              </w:tc>
-              <w:tc>
-                <w:tcPr/>
-                <w:p>
-                  <w:pPr>
-                    <w:pStyle w:val="Compact"/>
-                    <w:jc w:val="center"/>
-                  </w:pPr>
-                  <w:r>
-                    <w:t xml:space="preserve">3–7</w:t>
-                  </w:r>
-                </w:p>
-              </w:tc>
-              <w:tc>
-                <w:tcPr/>
-                <w:p>
-                  <w:pPr>
-                    <w:pStyle w:val="Compact"/>
-                    <w:jc w:val="center"/>
-                  </w:pPr>
-                  <w:r>
-                    <w:t xml:space="preserve">multivariate</w:t>
+                    <w:t xml:space="preserve">2.6</w:t>
+                  </w:r>
+                </w:p>
+              </w:tc>
+              <w:tc>
+                <w:tcPr/>
+                <w:p>
+                  <w:pPr>
+                    <w:pStyle w:val="Compact"/>
+                    <w:jc w:val="center"/>
+                  </w:pPr>
+                  <w:r>
+                    <w:t xml:space="preserve">2.1–3.1</w:t>
+                  </w:r>
+                </w:p>
+              </w:tc>
+              <w:tc>
+                <w:tcPr/>
+                <w:p>
+                  <w:pPr>
+                    <w:pStyle w:val="Compact"/>
+                    <w:jc w:val="center"/>
+                  </w:pPr>
+                  <w:r>
+                    <w:t xml:space="preserve">1.6–3.6</w:t>
                   </w:r>
                 </w:p>
               </w:tc>
@@ -8094,67 +8219,55 @@
                     <w:jc w:val="center"/>
                   </w:pPr>
                   <w:r>
-                    <w:t xml:space="preserve">Elution buffer pH</w:t>
-                  </w:r>
-                </w:p>
-              </w:tc>
-              <w:tc>
-                <w:tcPr/>
-                <w:p>
-                  <w:pPr>
-                    <w:pStyle w:val="Compact"/>
-                    <w:jc w:val="center"/>
-                  </w:pPr>
-                  <w:r>
-                    <w:t xml:space="preserve">pH</w:t>
-                  </w:r>
-                </w:p>
-              </w:tc>
-              <w:tc>
-                <w:tcPr/>
-                <w:p>
-                  <w:pPr>
-                    <w:pStyle w:val="Compact"/>
-                    <w:jc w:val="center"/>
-                  </w:pPr>
-                  <w:r>
-                    <w:t xml:space="preserve">6</w:t>
-                  </w:r>
-                </w:p>
-              </w:tc>
-              <w:tc>
-                <w:tcPr/>
-                <w:p>
-                  <w:pPr>
-                    <w:pStyle w:val="Compact"/>
-                    <w:jc w:val="center"/>
-                  </w:pPr>
-                  <w:r>
-                    <w:t xml:space="preserve">5.85–6.15</w:t>
-                  </w:r>
-                </w:p>
-              </w:tc>
-              <w:tc>
-                <w:tcPr/>
-                <w:p>
-                  <w:pPr>
-                    <w:pStyle w:val="Compact"/>
-                    <w:jc w:val="center"/>
-                  </w:pPr>
-                  <w:r>
-                    <w:t xml:space="preserve">5.8–6.2</w:t>
-                  </w:r>
-                </w:p>
-              </w:tc>
-              <w:tc>
-                <w:tcPr/>
-                <w:p>
-                  <w:pPr>
-                    <w:pStyle w:val="Compact"/>
-                    <w:jc w:val="center"/>
-                  </w:pPr>
-                  <w:r>
-                    <w:t xml:space="preserve">multivariate</w:t>
+                    <w:t xml:space="preserve">Load conductivity</w:t>
+                  </w:r>
+                </w:p>
+              </w:tc>
+              <w:tc>
+                <w:tcPr/>
+                <w:p>
+                  <w:pPr>
+                    <w:pStyle w:val="Compact"/>
+                    <w:jc w:val="center"/>
+                  </w:pPr>
+                  <w:r>
+                    <w:t xml:space="preserve">mS/cm</w:t>
+                  </w:r>
+                </w:p>
+              </w:tc>
+              <w:tc>
+                <w:tcPr/>
+                <w:p>
+                  <w:pPr>
+                    <w:pStyle w:val="Compact"/>
+                    <w:jc w:val="center"/>
+                  </w:pPr>
+                  <w:r>
+                    <w:t xml:space="preserve">5.5</w:t>
+                  </w:r>
+                </w:p>
+              </w:tc>
+              <w:tc>
+                <w:tcPr/>
+                <w:p>
+                  <w:pPr>
+                    <w:pStyle w:val="Compact"/>
+                    <w:jc w:val="center"/>
+                  </w:pPr>
+                  <w:r>
+                    <w:t xml:space="preserve">4–7</w:t>
+                  </w:r>
+                </w:p>
+              </w:tc>
+              <w:tc>
+                <w:tcPr/>
+                <w:p>
+                  <w:pPr>
+                    <w:pStyle w:val="Compact"/>
+                    <w:jc w:val="center"/>
+                  </w:pPr>
+                  <w:r>
+                    <w:t xml:space="preserve">3–8</w:t>
                   </w:r>
                 </w:p>
               </w:tc>
@@ -8189,67 +8302,55 @@
                     <w:jc w:val="center"/>
                   </w:pPr>
                   <w:r>
-                    <w:t xml:space="preserve">Elution stop collect</w:t>
-                  </w:r>
-                </w:p>
-              </w:tc>
-              <w:tc>
-                <w:tcPr/>
-                <w:p>
-                  <w:pPr>
-                    <w:pStyle w:val="Compact"/>
-                    <w:jc w:val="center"/>
-                  </w:pPr>
-                  <w:r>
-                    <w:t xml:space="preserve">AU (OD280, descending)</w:t>
-                  </w:r>
-                </w:p>
-              </w:tc>
-              <w:tc>
-                <w:tcPr/>
-                <w:p>
-                  <w:pPr>
-                    <w:pStyle w:val="Compact"/>
-                    <w:jc w:val="center"/>
-                  </w:pPr>
-                  <w:r>
-                    <w:t xml:space="preserve">1</w:t>
-                  </w:r>
-                </w:p>
-              </w:tc>
-              <w:tc>
-                <w:tcPr/>
-                <w:p>
-                  <w:pPr>
-                    <w:pStyle w:val="Compact"/>
-                    <w:jc w:val="center"/>
-                  </w:pPr>
-                  <w:r>
-                    <w:t xml:space="preserve">0.7–1.3</w:t>
-                  </w:r>
-                </w:p>
-              </w:tc>
-              <w:tc>
-                <w:tcPr/>
-                <w:p>
-                  <w:pPr>
-                    <w:pStyle w:val="Compact"/>
-                    <w:jc w:val="center"/>
-                  </w:pPr>
-                  <w:r>
-                    <w:t xml:space="preserve">0.5–1.5</w:t>
-                  </w:r>
-                </w:p>
-              </w:tc>
-              <w:tc>
-                <w:tcPr/>
-                <w:p>
-                  <w:pPr>
-                    <w:pStyle w:val="Compact"/>
-                    <w:jc w:val="center"/>
-                  </w:pPr>
-                  <w:r>
-                    <w:t xml:space="preserve">multivariate</w:t>
+                    <w:t xml:space="preserve">Protein load</w:t>
+                  </w:r>
+                </w:p>
+              </w:tc>
+              <w:tc>
+                <w:tcPr/>
+                <w:p>
+                  <w:pPr>
+                    <w:pStyle w:val="Compact"/>
+                    <w:jc w:val="center"/>
+                  </w:pPr>
+                  <w:r>
+                    <w:t xml:space="preserve">g/L resin</w:t>
+                  </w:r>
+                </w:p>
+              </w:tc>
+              <w:tc>
+                <w:tcPr/>
+                <w:p>
+                  <w:pPr>
+                    <w:pStyle w:val="Compact"/>
+                    <w:jc w:val="center"/>
+                  </w:pPr>
+                  <w:r>
+                    <w:t xml:space="preserve">200</w:t>
+                  </w:r>
+                </w:p>
+              </w:tc>
+              <w:tc>
+                <w:tcPr/>
+                <w:p>
+                  <w:pPr>
+                    <w:pStyle w:val="Compact"/>
+                    <w:jc w:val="center"/>
+                  </w:pPr>
+                  <w:r>
+                    <w:t xml:space="preserve">120–280</w:t>
+                  </w:r>
+                </w:p>
+              </w:tc>
+              <w:tc>
+                <w:tcPr/>
+                <w:p>
+                  <w:pPr>
+                    <w:pStyle w:val="Compact"/>
+                    <w:jc w:val="center"/>
+                  </w:pPr>
+                  <w:r>
+                    <w:t xml:space="preserve">50–300</w:t>
                   </w:r>
                 </w:p>
               </w:tc>
@@ -8284,67 +8385,7 @@
                     <w:jc w:val="center"/>
                   </w:pPr>
                   <w:r>
-                    <w:t xml:space="preserve">Elution flow rate</w:t>
-                  </w:r>
-                </w:p>
-              </w:tc>
-              <w:tc>
-                <w:tcPr/>
-                <w:p>
-                  <w:pPr>
-                    <w:pStyle w:val="Compact"/>
-                    <w:jc w:val="center"/>
-                  </w:pPr>
-                  <w:r>
-                    <w:t xml:space="preserve">cm/hr</w:t>
-                  </w:r>
-                </w:p>
-              </w:tc>
-              <w:tc>
-                <w:tcPr/>
-                <w:p>
-                  <w:pPr>
-                    <w:pStyle w:val="Compact"/>
-                    <w:jc w:val="center"/>
-                  </w:pPr>
-                  <w:r>
-                    <w:t xml:space="preserve">200</w:t>
-                  </w:r>
-                </w:p>
-              </w:tc>
-              <w:tc>
-                <w:tcPr/>
-                <w:p>
-                  <w:pPr>
-                    <w:pStyle w:val="Compact"/>
-                    <w:jc w:val="center"/>
-                  </w:pPr>
-                  <w:r>
-                    <w:t xml:space="preserve">150–250</w:t>
-                  </w:r>
-                </w:p>
-              </w:tc>
-              <w:tc>
-                <w:tcPr/>
-                <w:p>
-                  <w:pPr>
-                    <w:pStyle w:val="Compact"/>
-                    <w:jc w:val="center"/>
-                  </w:pPr>
-                  <w:r>
-                    <w:t xml:space="preserve">100–300</w:t>
-                  </w:r>
-                </w:p>
-              </w:tc>
-              <w:tc>
-                <w:tcPr/>
-                <w:p>
-                  <w:pPr>
-                    <w:pStyle w:val="Compact"/>
-                    <w:jc w:val="center"/>
-                  </w:pPr>
-                  <w:r>
-                    <w:t xml:space="preserve">univariate</w:t>
+                    <w:t xml:space="preserve">Operating flow rate</w:t>
                   </w:r>
                   <w:r>
                     <w:rPr>
@@ -8362,7 +8403,55 @@
                     <w:jc w:val="center"/>
                   </w:pPr>
                   <w:r>
-                    <w:t xml:space="preserve">GPP</w:t>
+                    <w:t xml:space="preserve">cm/hr</w:t>
+                  </w:r>
+                </w:p>
+              </w:tc>
+              <w:tc>
+                <w:tcPr/>
+                <w:p>
+                  <w:pPr>
+                    <w:pStyle w:val="Compact"/>
+                    <w:jc w:val="center"/>
+                  </w:pPr>
+                  <w:r>
+                    <w:t xml:space="preserve">300</w:t>
+                  </w:r>
+                </w:p>
+              </w:tc>
+              <w:tc>
+                <w:tcPr/>
+                <w:p>
+                  <w:pPr>
+                    <w:pStyle w:val="Compact"/>
+                    <w:jc w:val="center"/>
+                  </w:pPr>
+                  <w:r>
+                    <w:t xml:space="preserve">200–400</w:t>
+                  </w:r>
+                </w:p>
+              </w:tc>
+              <w:tc>
+                <w:tcPr/>
+                <w:p>
+                  <w:pPr>
+                    <w:pStyle w:val="Compact"/>
+                    <w:jc w:val="center"/>
+                  </w:pPr>
+                  <w:r>
+                    <w:t xml:space="preserve">150–450</w:t>
+                  </w:r>
+                </w:p>
+              </w:tc>
+              <w:tc>
+                <w:tcPr/>
+                <w:p>
+                  <w:pPr>
+                    <w:pStyle w:val="Compact"/>
+                    <w:jc w:val="center"/>
+                  </w:pPr>
+                  <w:r>
+                    <w:t xml:space="preserve">WC-CPP</w:t>
                   </w:r>
                 </w:p>
               </w:tc>
@@ -8378,79 +8467,67 @@
                     <w:jc w:val="center"/>
                   </w:pPr>
                   <w:r>
-                    <w:t xml:space="preserve">Anion exchange</w:t>
-                  </w:r>
-                </w:p>
-              </w:tc>
-              <w:tc>
-                <w:tcPr/>
-                <w:p>
-                  <w:pPr>
-                    <w:pStyle w:val="Compact"/>
-                    <w:jc w:val="center"/>
-                  </w:pPr>
-                  <w:r>
-                    <w:t xml:space="preserve">Load pH</w:t>
-                  </w:r>
-                </w:p>
-              </w:tc>
-              <w:tc>
-                <w:tcPr/>
-                <w:p>
-                  <w:pPr>
-                    <w:pStyle w:val="Compact"/>
-                    <w:jc w:val="center"/>
-                  </w:pPr>
-                  <w:r>
-                    <w:t xml:space="preserve">pH</w:t>
-                  </w:r>
-                </w:p>
-              </w:tc>
-              <w:tc>
-                <w:tcPr/>
-                <w:p>
-                  <w:pPr>
-                    <w:pStyle w:val="Compact"/>
-                    <w:jc w:val="center"/>
-                  </w:pPr>
-                  <w:r>
-                    <w:t xml:space="preserve">7.5</w:t>
-                  </w:r>
-                </w:p>
-              </w:tc>
-              <w:tc>
-                <w:tcPr/>
-                <w:p>
-                  <w:pPr>
-                    <w:pStyle w:val="Compact"/>
-                    <w:jc w:val="center"/>
-                  </w:pPr>
-                  <w:r>
-                    <w:t xml:space="preserve">7.35–7.65</w:t>
-                  </w:r>
-                </w:p>
-              </w:tc>
-              <w:tc>
-                <w:tcPr/>
-                <w:p>
-                  <w:pPr>
-                    <w:pStyle w:val="Compact"/>
-                    <w:jc w:val="center"/>
-                  </w:pPr>
-                  <w:r>
-                    <w:t xml:space="preserve">7.2–7.8</w:t>
-                  </w:r>
-                </w:p>
-              </w:tc>
-              <w:tc>
-                <w:tcPr/>
-                <w:p>
-                  <w:pPr>
-                    <w:pStyle w:val="Compact"/>
-                    <w:jc w:val="center"/>
-                  </w:pPr>
-                  <w:r>
-                    <w:t xml:space="preserve">multivariate</w:t>
+                    <w:t xml:space="preserve">Virus filtration</w:t>
+                  </w:r>
+                </w:p>
+              </w:tc>
+              <w:tc>
+                <w:tcPr/>
+                <w:p>
+                  <w:pPr>
+                    <w:pStyle w:val="Compact"/>
+                    <w:jc w:val="center"/>
+                  </w:pPr>
+                  <w:r>
+                    <w:t xml:space="preserve">Filtration volume (load)</w:t>
+                  </w:r>
+                </w:p>
+              </w:tc>
+              <w:tc>
+                <w:tcPr/>
+                <w:p>
+                  <w:pPr>
+                    <w:pStyle w:val="Compact"/>
+                    <w:jc w:val="center"/>
+                  </w:pPr>
+                  <w:r>
+                    <w:t xml:space="preserve">L/m2</w:t>
+                  </w:r>
+                </w:p>
+              </w:tc>
+              <w:tc>
+                <w:tcPr/>
+                <w:p>
+                  <w:pPr>
+                    <w:pStyle w:val="Compact"/>
+                    <w:jc w:val="center"/>
+                  </w:pPr>
+                  <w:r>
+                    <w:t xml:space="preserve">90</w:t>
+                  </w:r>
+                </w:p>
+              </w:tc>
+              <w:tc>
+                <w:tcPr/>
+                <w:p>
+                  <w:pPr>
+                    <w:pStyle w:val="Compact"/>
+                    <w:jc w:val="center"/>
+                  </w:pPr>
+                  <w:r>
+                    <w:t xml:space="preserve">50–105</w:t>
+                  </w:r>
+                </w:p>
+              </w:tc>
+              <w:tc>
+                <w:tcPr/>
+                <w:p>
+                  <w:pPr>
+                    <w:pStyle w:val="Compact"/>
+                    <w:jc w:val="center"/>
+                  </w:pPr>
+                  <w:r>
+                    <w:t xml:space="preserve">50–140</w:t>
                   </w:r>
                 </w:p>
               </w:tc>
@@ -8485,67 +8562,55 @@
                     <w:jc w:val="center"/>
                   </w:pPr>
                   <w:r>
-                    <w:t xml:space="preserve">Equil/Wash-1 conductivity</w:t>
-                  </w:r>
-                </w:p>
-              </w:tc>
-              <w:tc>
-                <w:tcPr/>
-                <w:p>
-                  <w:pPr>
-                    <w:pStyle w:val="Compact"/>
-                    <w:jc w:val="center"/>
-                  </w:pPr>
-                  <w:r>
-                    <w:t xml:space="preserve">mS/cm</w:t>
-                  </w:r>
-                </w:p>
-              </w:tc>
-              <w:tc>
-                <w:tcPr/>
-                <w:p>
-                  <w:pPr>
-                    <w:pStyle w:val="Compact"/>
-                    <w:jc w:val="center"/>
-                  </w:pPr>
-                  <w:r>
-                    <w:t xml:space="preserve">2.6</w:t>
-                  </w:r>
-                </w:p>
-              </w:tc>
-              <w:tc>
-                <w:tcPr/>
-                <w:p>
-                  <w:pPr>
-                    <w:pStyle w:val="Compact"/>
-                    <w:jc w:val="center"/>
-                  </w:pPr>
-                  <w:r>
-                    <w:t xml:space="preserve">2.1–3.1</w:t>
-                  </w:r>
-                </w:p>
-              </w:tc>
-              <w:tc>
-                <w:tcPr/>
-                <w:p>
-                  <w:pPr>
-                    <w:pStyle w:val="Compact"/>
-                    <w:jc w:val="center"/>
-                  </w:pPr>
-                  <w:r>
-                    <w:t xml:space="preserve">1.6–3.6</w:t>
-                  </w:r>
-                </w:p>
-              </w:tc>
-              <w:tc>
-                <w:tcPr/>
-                <w:p>
-                  <w:pPr>
-                    <w:pStyle w:val="Compact"/>
-                    <w:jc w:val="center"/>
-                  </w:pPr>
-                  <w:r>
-                    <w:t xml:space="preserve">multivariate</w:t>
+                    <w:t xml:space="preserve">Filtration pressure</w:t>
+                  </w:r>
+                </w:p>
+              </w:tc>
+              <w:tc>
+                <w:tcPr/>
+                <w:p>
+                  <w:pPr>
+                    <w:pStyle w:val="Compact"/>
+                    <w:jc w:val="center"/>
+                  </w:pPr>
+                  <w:r>
+                    <w:t xml:space="preserve">psi</w:t>
+                  </w:r>
+                </w:p>
+              </w:tc>
+              <w:tc>
+                <w:tcPr/>
+                <w:p>
+                  <w:pPr>
+                    <w:pStyle w:val="Compact"/>
+                    <w:jc w:val="center"/>
+                  </w:pPr>
+                  <w:r>
+                    <w:t xml:space="preserve">13</w:t>
+                  </w:r>
+                </w:p>
+              </w:tc>
+              <w:tc>
+                <w:tcPr/>
+                <w:p>
+                  <w:pPr>
+                    <w:pStyle w:val="Compact"/>
+                    <w:jc w:val="center"/>
+                  </w:pPr>
+                  <w:r>
+                    <w:t xml:space="preserve">10–20</w:t>
+                  </w:r>
+                </w:p>
+              </w:tc>
+              <w:tc>
+                <w:tcPr/>
+                <w:p>
+                  <w:pPr>
+                    <w:pStyle w:val="Compact"/>
+                    <w:jc w:val="center"/>
+                  </w:pPr>
+                  <w:r>
+                    <w:t xml:space="preserve">8–30</w:t>
                   </w:r>
                 </w:p>
               </w:tc>
@@ -8565,272 +8630,27 @@
             <w:tr>
               <w:tc>
                 <w:tcPr>
-                  <w:gridSpan w:val="1"/>
-                  <w:vMerge w:val="continue"/>
-                </w:tcPr>
-                <w:p>
-                  <w:pPr/>
-                </w:p>
-              </w:tc>
-              <w:tc>
-                <w:tcPr/>
-                <w:p>
-                  <w:pPr>
-                    <w:pStyle w:val="Compact"/>
-                    <w:jc w:val="center"/>
-                  </w:pPr>
-                  <w:r>
-                    <w:t xml:space="preserve">Load conductivity</w:t>
-                  </w:r>
-                </w:p>
-              </w:tc>
-              <w:tc>
-                <w:tcPr/>
-                <w:p>
-                  <w:pPr>
-                    <w:pStyle w:val="Compact"/>
-                    <w:jc w:val="center"/>
-                  </w:pPr>
-                  <w:r>
-                    <w:t xml:space="preserve">mS/cm</w:t>
-                  </w:r>
-                </w:p>
-              </w:tc>
-              <w:tc>
-                <w:tcPr/>
-                <w:p>
-                  <w:pPr>
-                    <w:pStyle w:val="Compact"/>
-                    <w:jc w:val="center"/>
-                  </w:pPr>
-                  <w:r>
-                    <w:t xml:space="preserve">5.5</w:t>
-                  </w:r>
-                </w:p>
-              </w:tc>
-              <w:tc>
-                <w:tcPr/>
-                <w:p>
-                  <w:pPr>
-                    <w:pStyle w:val="Compact"/>
-                    <w:jc w:val="center"/>
-                  </w:pPr>
-                  <w:r>
-                    <w:t xml:space="preserve">4–7</w:t>
-                  </w:r>
-                </w:p>
-              </w:tc>
-              <w:tc>
-                <w:tcPr/>
-                <w:p>
-                  <w:pPr>
-                    <w:pStyle w:val="Compact"/>
-                    <w:jc w:val="center"/>
-                  </w:pPr>
-                  <w:r>
-                    <w:t xml:space="preserve">3–8</w:t>
-                  </w:r>
-                </w:p>
-              </w:tc>
-              <w:tc>
-                <w:tcPr/>
-                <w:p>
-                  <w:pPr>
-                    <w:pStyle w:val="Compact"/>
-                    <w:jc w:val="center"/>
-                  </w:pPr>
-                  <w:r>
-                    <w:t xml:space="preserve">multivariate</w:t>
-                  </w:r>
-                </w:p>
-              </w:tc>
-              <w:tc>
-                <w:tcPr/>
-                <w:p>
-                  <w:pPr>
-                    <w:pStyle w:val="Compact"/>
-                    <w:jc w:val="center"/>
-                  </w:pPr>
-                  <w:r>
-                    <w:t xml:space="preserve">WC-CPP</w:t>
-                  </w:r>
-                </w:p>
-              </w:tc>
-            </w:tr>
-            <w:tr>
-              <w:tc>
-                <w:tcPr>
-                  <w:gridSpan w:val="1"/>
-                  <w:vMerge w:val="continue"/>
-                </w:tcPr>
-                <w:p>
-                  <w:pPr/>
-                </w:p>
-              </w:tc>
-              <w:tc>
-                <w:tcPr/>
-                <w:p>
-                  <w:pPr>
-                    <w:pStyle w:val="Compact"/>
-                    <w:jc w:val="center"/>
-                  </w:pPr>
-                  <w:r>
-                    <w:t xml:space="preserve">Protein load</w:t>
-                  </w:r>
-                </w:p>
-              </w:tc>
-              <w:tc>
-                <w:tcPr/>
-                <w:p>
-                  <w:pPr>
-                    <w:pStyle w:val="Compact"/>
-                    <w:jc w:val="center"/>
-                  </w:pPr>
-                  <w:r>
-                    <w:t xml:space="preserve">g/L resin</w:t>
-                  </w:r>
-                </w:p>
-              </w:tc>
-              <w:tc>
-                <w:tcPr/>
-                <w:p>
-                  <w:pPr>
-                    <w:pStyle w:val="Compact"/>
-                    <w:jc w:val="center"/>
-                  </w:pPr>
-                  <w:r>
-                    <w:t xml:space="preserve">200</w:t>
-                  </w:r>
-                </w:p>
-              </w:tc>
-              <w:tc>
-                <w:tcPr/>
-                <w:p>
-                  <w:pPr>
-                    <w:pStyle w:val="Compact"/>
-                    <w:jc w:val="center"/>
-                  </w:pPr>
-                  <w:r>
-                    <w:t xml:space="preserve">120–280</w:t>
-                  </w:r>
-                </w:p>
-              </w:tc>
-              <w:tc>
-                <w:tcPr/>
-                <w:p>
-                  <w:pPr>
-                    <w:pStyle w:val="Compact"/>
-                    <w:jc w:val="center"/>
-                  </w:pPr>
-                  <w:r>
-                    <w:t xml:space="preserve">50–300</w:t>
-                  </w:r>
-                </w:p>
-              </w:tc>
-              <w:tc>
-                <w:tcPr/>
-                <w:p>
-                  <w:pPr>
-                    <w:pStyle w:val="Compact"/>
-                    <w:jc w:val="center"/>
-                  </w:pPr>
-                  <w:r>
-                    <w:t xml:space="preserve">multivariate</w:t>
-                  </w:r>
-                </w:p>
-              </w:tc>
-              <w:tc>
-                <w:tcPr/>
-                <w:p>
-                  <w:pPr>
-                    <w:pStyle w:val="Compact"/>
-                    <w:jc w:val="center"/>
-                  </w:pPr>
-                  <w:r>
-                    <w:t xml:space="preserve">WC-CPP</w:t>
-                  </w:r>
-                </w:p>
-              </w:tc>
-            </w:tr>
-            <w:tr>
-              <w:tc>
-                <w:tcPr>
-                  <w:gridSpan w:val="1"/>
-                  <w:vMerge w:val="continue"/>
-                </w:tcPr>
-                <w:p>
-                  <w:pPr/>
-                </w:p>
-              </w:tc>
-              <w:tc>
-                <w:tcPr/>
-                <w:p>
-                  <w:pPr>
-                    <w:pStyle w:val="Compact"/>
-                    <w:jc w:val="center"/>
-                  </w:pPr>
-                  <w:r>
-                    <w:t xml:space="preserve">Operating flow rate</w:t>
-                  </w:r>
-                </w:p>
-              </w:tc>
-              <w:tc>
-                <w:tcPr/>
-                <w:p>
-                  <w:pPr>
-                    <w:pStyle w:val="Compact"/>
-                    <w:jc w:val="center"/>
-                  </w:pPr>
-                  <w:r>
-                    <w:t xml:space="preserve">cm/hr</w:t>
-                  </w:r>
-                </w:p>
-              </w:tc>
-              <w:tc>
-                <w:tcPr/>
-                <w:p>
-                  <w:pPr>
-                    <w:pStyle w:val="Compact"/>
-                    <w:jc w:val="center"/>
-                  </w:pPr>
-                  <w:r>
-                    <w:t xml:space="preserve">300</w:t>
-                  </w:r>
-                </w:p>
-              </w:tc>
-              <w:tc>
-                <w:tcPr/>
-                <w:p>
-                  <w:pPr>
-                    <w:pStyle w:val="Compact"/>
-                    <w:jc w:val="center"/>
-                  </w:pPr>
-                  <w:r>
-                    <w:t xml:space="preserve">200–400</w:t>
-                  </w:r>
-                </w:p>
-              </w:tc>
-              <w:tc>
-                <w:tcPr/>
-                <w:p>
-                  <w:pPr>
-                    <w:pStyle w:val="Compact"/>
-                    <w:jc w:val="center"/>
-                  </w:pPr>
-                  <w:r>
-                    <w:t xml:space="preserve">150–450</w:t>
-                  </w:r>
-                </w:p>
-              </w:tc>
-              <w:tc>
-                <w:tcPr/>
-                <w:p>
-                  <w:pPr>
-                    <w:pStyle w:val="Compact"/>
-                    <w:jc w:val="center"/>
-                  </w:pPr>
-                  <w:r>
-                    <w:t xml:space="preserve">univariate</w:t>
+                  <w:vMerge w:val="restart"/>
+                </w:tcPr>
+                <w:p>
+                  <w:pPr>
+                    <w:pStyle w:val="Compact"/>
+                    <w:jc w:val="center"/>
+                  </w:pPr>
+                  <w:r>
+                    <w:t xml:space="preserve">UF/DF</w:t>
+                  </w:r>
+                </w:p>
+              </w:tc>
+              <w:tc>
+                <w:tcPr/>
+                <w:p>
+                  <w:pPr>
+                    <w:pStyle w:val="Compact"/>
+                    <w:jc w:val="center"/>
+                  </w:pPr>
+                  <w:r>
+                    <w:t xml:space="preserve">Number of diavolumes</w:t>
                   </w:r>
                   <w:r>
                     <w:rPr>
@@ -8848,107 +8668,55 @@
                     <w:jc w:val="center"/>
                   </w:pPr>
                   <w:r>
-                    <w:t xml:space="preserve">WC-CPP</w:t>
-                  </w:r>
-                </w:p>
-              </w:tc>
-            </w:tr>
-            <w:tr>
-              <w:tc>
-                <w:tcPr>
-                  <w:vMerge w:val="restart"/>
-                </w:tcPr>
-                <w:p>
-                  <w:pPr>
-                    <w:pStyle w:val="Compact"/>
-                    <w:jc w:val="center"/>
-                  </w:pPr>
-                  <w:r>
-                    <w:t xml:space="preserve">Virus filtration</w:t>
-                  </w:r>
-                </w:p>
-              </w:tc>
-              <w:tc>
-                <w:tcPr/>
-                <w:p>
-                  <w:pPr>
-                    <w:pStyle w:val="Compact"/>
-                    <w:jc w:val="center"/>
-                  </w:pPr>
-                  <w:r>
-                    <w:t xml:space="preserve">Filtration volume (load)</w:t>
-                  </w:r>
-                </w:p>
-              </w:tc>
-              <w:tc>
-                <w:tcPr/>
-                <w:p>
-                  <w:pPr>
-                    <w:pStyle w:val="Compact"/>
-                    <w:jc w:val="center"/>
-                  </w:pPr>
-                  <w:r>
-                    <w:t xml:space="preserve">L/m2</w:t>
-                  </w:r>
-                </w:p>
-              </w:tc>
-              <w:tc>
-                <w:tcPr/>
-                <w:p>
-                  <w:pPr>
-                    <w:pStyle w:val="Compact"/>
-                    <w:jc w:val="center"/>
-                  </w:pPr>
-                  <w:r>
-                    <w:t xml:space="preserve">90</w:t>
-                  </w:r>
-                </w:p>
-              </w:tc>
-              <w:tc>
-                <w:tcPr/>
-                <w:p>
-                  <w:pPr>
-                    <w:pStyle w:val="Compact"/>
-                    <w:jc w:val="center"/>
-                  </w:pPr>
-                  <w:r>
-                    <w:t xml:space="preserve">50–105</w:t>
-                  </w:r>
-                </w:p>
-              </w:tc>
-              <w:tc>
-                <w:tcPr/>
-                <w:p>
-                  <w:pPr>
-                    <w:pStyle w:val="Compact"/>
-                    <w:jc w:val="center"/>
-                  </w:pPr>
-                  <w:r>
-                    <w:t xml:space="preserve">50–140</w:t>
-                  </w:r>
-                </w:p>
-              </w:tc>
-              <w:tc>
-                <w:tcPr/>
-                <w:p>
-                  <w:pPr>
-                    <w:pStyle w:val="Compact"/>
-                    <w:jc w:val="center"/>
-                  </w:pPr>
-                  <w:r>
-                    <w:t xml:space="preserve">multivariate</w:t>
-                  </w:r>
-                </w:p>
-              </w:tc>
-              <w:tc>
-                <w:tcPr/>
-                <w:p>
-                  <w:pPr>
-                    <w:pStyle w:val="Compact"/>
-                    <w:jc w:val="center"/>
-                  </w:pPr>
-                  <w:r>
-                    <w:t xml:space="preserve">WC-CPP</w:t>
+                    <w:t xml:space="preserve">DV</w:t>
+                  </w:r>
+                </w:p>
+              </w:tc>
+              <w:tc>
+                <w:tcPr/>
+                <w:p>
+                  <w:pPr>
+                    <w:pStyle w:val="Compact"/>
+                    <w:jc w:val="center"/>
+                  </w:pPr>
+                  <w:r>
+                    <w:t xml:space="preserve">8</w:t>
+                  </w:r>
+                </w:p>
+              </w:tc>
+              <w:tc>
+                <w:tcPr/>
+                <w:p>
+                  <w:pPr>
+                    <w:pStyle w:val="Compact"/>
+                    <w:jc w:val="center"/>
+                  </w:pPr>
+                  <w:r>
+                    <w:t xml:space="preserve">7–9</w:t>
+                  </w:r>
+                </w:p>
+              </w:tc>
+              <w:tc>
+                <w:tcPr/>
+                <w:p>
+                  <w:pPr>
+                    <w:pStyle w:val="Compact"/>
+                    <w:jc w:val="center"/>
+                  </w:pPr>
+                  <w:r>
+                    <w:t xml:space="preserve">7–10</w:t>
+                  </w:r>
+                </w:p>
+              </w:tc>
+              <w:tc>
+                <w:tcPr/>
+                <w:p>
+                  <w:pPr>
+                    <w:pStyle w:val="Compact"/>
+                    <w:jc w:val="center"/>
+                  </w:pPr>
+                  <w:r>
+                    <w:t xml:space="preserve">KPP</w:t>
                   </w:r>
                 </w:p>
               </w:tc>
@@ -8971,167 +8739,7 @@
                     <w:jc w:val="center"/>
                   </w:pPr>
                   <w:r>
-                    <w:t xml:space="preserve">Filtration pressure</w:t>
-                  </w:r>
-                </w:p>
-              </w:tc>
-              <w:tc>
-                <w:tcPr/>
-                <w:p>
-                  <w:pPr>
-                    <w:pStyle w:val="Compact"/>
-                    <w:jc w:val="center"/>
-                  </w:pPr>
-                  <w:r>
-                    <w:t xml:space="preserve">psi</w:t>
-                  </w:r>
-                </w:p>
-              </w:tc>
-              <w:tc>
-                <w:tcPr/>
-                <w:p>
-                  <w:pPr>
-                    <w:pStyle w:val="Compact"/>
-                    <w:jc w:val="center"/>
-                  </w:pPr>
-                  <w:r>
-                    <w:t xml:space="preserve">13</w:t>
-                  </w:r>
-                </w:p>
-              </w:tc>
-              <w:tc>
-                <w:tcPr/>
-                <w:p>
-                  <w:pPr>
-                    <w:pStyle w:val="Compact"/>
-                    <w:jc w:val="center"/>
-                  </w:pPr>
-                  <w:r>
-                    <w:t xml:space="preserve">10–20</w:t>
-                  </w:r>
-                </w:p>
-              </w:tc>
-              <w:tc>
-                <w:tcPr/>
-                <w:p>
-                  <w:pPr>
-                    <w:pStyle w:val="Compact"/>
-                    <w:jc w:val="center"/>
-                  </w:pPr>
-                  <w:r>
-                    <w:t xml:space="preserve">8–30</w:t>
-                  </w:r>
-                </w:p>
-              </w:tc>
-              <w:tc>
-                <w:tcPr/>
-                <w:p>
-                  <w:pPr>
-                    <w:pStyle w:val="Compact"/>
-                    <w:jc w:val="center"/>
-                  </w:pPr>
-                  <w:r>
-                    <w:t xml:space="preserve">multivariate</w:t>
-                  </w:r>
-                </w:p>
-              </w:tc>
-              <w:tc>
-                <w:tcPr/>
-                <w:p>
-                  <w:pPr>
-                    <w:pStyle w:val="Compact"/>
-                    <w:jc w:val="center"/>
-                  </w:pPr>
-                  <w:r>
-                    <w:t xml:space="preserve">WC-CPP</w:t>
-                  </w:r>
-                </w:p>
-              </w:tc>
-            </w:tr>
-            <w:tr>
-              <w:tc>
-                <w:tcPr>
-                  <w:vMerge w:val="restart"/>
-                </w:tcPr>
-                <w:p>
-                  <w:pPr>
-                    <w:pStyle w:val="Compact"/>
-                    <w:jc w:val="center"/>
-                  </w:pPr>
-                  <w:r>
-                    <w:t xml:space="preserve">UF/DF</w:t>
-                  </w:r>
-                </w:p>
-              </w:tc>
-              <w:tc>
-                <w:tcPr/>
-                <w:p>
-                  <w:pPr>
-                    <w:pStyle w:val="Compact"/>
-                    <w:jc w:val="center"/>
-                  </w:pPr>
-                  <w:r>
-                    <w:t xml:space="preserve">Number of diavolumes</w:t>
-                  </w:r>
-                </w:p>
-              </w:tc>
-              <w:tc>
-                <w:tcPr/>
-                <w:p>
-                  <w:pPr>
-                    <w:pStyle w:val="Compact"/>
-                    <w:jc w:val="center"/>
-                  </w:pPr>
-                  <w:r>
-                    <w:t xml:space="preserve">DV</w:t>
-                  </w:r>
-                </w:p>
-              </w:tc>
-              <w:tc>
-                <w:tcPr/>
-                <w:p>
-                  <w:pPr>
-                    <w:pStyle w:val="Compact"/>
-                    <w:jc w:val="center"/>
-                  </w:pPr>
-                  <w:r>
-                    <w:t xml:space="preserve">8</w:t>
-                  </w:r>
-                </w:p>
-              </w:tc>
-              <w:tc>
-                <w:tcPr/>
-                <w:p>
-                  <w:pPr>
-                    <w:pStyle w:val="Compact"/>
-                    <w:jc w:val="center"/>
-                  </w:pPr>
-                  <w:r>
-                    <w:t xml:space="preserve">7–9</w:t>
-                  </w:r>
-                </w:p>
-              </w:tc>
-              <w:tc>
-                <w:tcPr/>
-                <w:p>
-                  <w:pPr>
-                    <w:pStyle w:val="Compact"/>
-                    <w:jc w:val="center"/>
-                  </w:pPr>
-                  <w:r>
-                    <w:t xml:space="preserve">7–10</w:t>
-                  </w:r>
-                </w:p>
-              </w:tc>
-              <w:tc>
-                <w:tcPr/>
-                <w:p>
-                  <w:pPr>
-                    <w:pStyle w:val="Compact"/>
-                    <w:jc w:val="center"/>
-                  </w:pPr>
-                  <w:r>
-                    <w:t xml:space="preserve">univariate</w:t>
+                    <w:t xml:space="preserve">Transmembrane pressure</w:t>
                   </w:r>
                   <w:r>
                     <w:rPr>
@@ -9149,6 +8757,54 @@
                     <w:jc w:val="center"/>
                   </w:pPr>
                   <w:r>
+                    <w:t xml:space="preserve">psi</w:t>
+                  </w:r>
+                </w:p>
+              </w:tc>
+              <w:tc>
+                <w:tcPr/>
+                <w:p>
+                  <w:pPr>
+                    <w:pStyle w:val="Compact"/>
+                    <w:jc w:val="center"/>
+                  </w:pPr>
+                  <w:r>
+                    <w:t xml:space="preserve">12</w:t>
+                  </w:r>
+                </w:p>
+              </w:tc>
+              <w:tc>
+                <w:tcPr/>
+                <w:p>
+                  <w:pPr>
+                    <w:pStyle w:val="Compact"/>
+                    <w:jc w:val="center"/>
+                  </w:pPr>
+                  <w:r>
+                    <w:t xml:space="preserve">10–14</w:t>
+                  </w:r>
+                </w:p>
+              </w:tc>
+              <w:tc>
+                <w:tcPr/>
+                <w:p>
+                  <w:pPr>
+                    <w:pStyle w:val="Compact"/>
+                    <w:jc w:val="center"/>
+                  </w:pPr>
+                  <w:r>
+                    <w:t xml:space="preserve">10–15</w:t>
+                  </w:r>
+                </w:p>
+              </w:tc>
+              <w:tc>
+                <w:tcPr/>
+                <w:p>
+                  <w:pPr>
+                    <w:pStyle w:val="Compact"/>
+                    <w:jc w:val="center"/>
+                  </w:pPr>
+                  <w:r>
                     <w:t xml:space="preserve">KPP</w:t>
                   </w:r>
                 </w:p>
@@ -9172,67 +8828,7 @@
                     <w:jc w:val="center"/>
                   </w:pPr>
                   <w:r>
-                    <w:t xml:space="preserve">Transmembrane pressure</w:t>
-                  </w:r>
-                </w:p>
-              </w:tc>
-              <w:tc>
-                <w:tcPr/>
-                <w:p>
-                  <w:pPr>
-                    <w:pStyle w:val="Compact"/>
-                    <w:jc w:val="center"/>
-                  </w:pPr>
-                  <w:r>
-                    <w:t xml:space="preserve">psi</w:t>
-                  </w:r>
-                </w:p>
-              </w:tc>
-              <w:tc>
-                <w:tcPr/>
-                <w:p>
-                  <w:pPr>
-                    <w:pStyle w:val="Compact"/>
-                    <w:jc w:val="center"/>
-                  </w:pPr>
-                  <w:r>
-                    <w:t xml:space="preserve">12</w:t>
-                  </w:r>
-                </w:p>
-              </w:tc>
-              <w:tc>
-                <w:tcPr/>
-                <w:p>
-                  <w:pPr>
-                    <w:pStyle w:val="Compact"/>
-                    <w:jc w:val="center"/>
-                  </w:pPr>
-                  <w:r>
-                    <w:t xml:space="preserve">10–14</w:t>
-                  </w:r>
-                </w:p>
-              </w:tc>
-              <w:tc>
-                <w:tcPr/>
-                <w:p>
-                  <w:pPr>
-                    <w:pStyle w:val="Compact"/>
-                    <w:jc w:val="center"/>
-                  </w:pPr>
-                  <w:r>
-                    <w:t xml:space="preserve">10–15</w:t>
-                  </w:r>
-                </w:p>
-              </w:tc>
-              <w:tc>
-                <w:tcPr/>
-                <w:p>
-                  <w:pPr>
-                    <w:pStyle w:val="Compact"/>
-                    <w:jc w:val="center"/>
-                  </w:pPr>
-                  <w:r>
-                    <w:t xml:space="preserve">univariate</w:t>
+                    <w:t xml:space="preserve">Final DS concentration</w:t>
                   </w:r>
                   <w:r>
                     <w:rPr>
@@ -9250,6 +8846,54 @@
                     <w:jc w:val="center"/>
                   </w:pPr>
                   <w:r>
+                    <w:t xml:space="preserve">g/L</w:t>
+                  </w:r>
+                </w:p>
+              </w:tc>
+              <w:tc>
+                <w:tcPr/>
+                <w:p>
+                  <w:pPr>
+                    <w:pStyle w:val="Compact"/>
+                    <w:jc w:val="center"/>
+                  </w:pPr>
+                  <w:r>
+                    <w:t xml:space="preserve">75</w:t>
+                  </w:r>
+                </w:p>
+              </w:tc>
+              <w:tc>
+                <w:tcPr/>
+                <w:p>
+                  <w:pPr>
+                    <w:pStyle w:val="Compact"/>
+                    <w:jc w:val="center"/>
+                  </w:pPr>
+                  <w:r>
+                    <w:t xml:space="preserve">70–80</w:t>
+                  </w:r>
+                </w:p>
+              </w:tc>
+              <w:tc>
+                <w:tcPr/>
+                <w:p>
+                  <w:pPr>
+                    <w:pStyle w:val="Compact"/>
+                    <w:jc w:val="center"/>
+                  </w:pPr>
+                  <w:r>
+                    <w:t xml:space="preserve">65–85</w:t>
+                  </w:r>
+                </w:p>
+              </w:tc>
+              <w:tc>
+                <w:tcPr/>
+                <w:p>
+                  <w:pPr>
+                    <w:pStyle w:val="Compact"/>
+                    <w:jc w:val="center"/>
+                  </w:pPr>
+                  <w:r>
                     <w:t xml:space="preserve">KPP</w:t>
                   </w:r>
                 </w:p>
@@ -9258,133 +8902,32 @@
             <w:tr>
               <w:tc>
                 <w:tcPr>
-                  <w:gridSpan w:val="1"/>
-                  <w:vMerge w:val="continue"/>
-                </w:tcPr>
-                <w:p>
-                  <w:pPr/>
-                </w:p>
-              </w:tc>
-              <w:tc>
-                <w:tcPr/>
-                <w:p>
-                  <w:pPr>
-                    <w:pStyle w:val="Compact"/>
-                    <w:jc w:val="center"/>
-                  </w:pPr>
-                  <w:r>
-                    <w:t xml:space="preserve">Final DS concentration</w:t>
-                  </w:r>
-                </w:p>
-              </w:tc>
-              <w:tc>
-                <w:tcPr/>
-                <w:p>
-                  <w:pPr>
-                    <w:pStyle w:val="Compact"/>
-                    <w:jc w:val="center"/>
-                  </w:pPr>
-                  <w:r>
-                    <w:t xml:space="preserve">g/L</w:t>
-                  </w:r>
-                </w:p>
-              </w:tc>
-              <w:tc>
-                <w:tcPr/>
-                <w:p>
-                  <w:pPr>
-                    <w:pStyle w:val="Compact"/>
-                    <w:jc w:val="center"/>
-                  </w:pPr>
-                  <w:r>
-                    <w:t xml:space="preserve">75</w:t>
-                  </w:r>
-                </w:p>
-              </w:tc>
-              <w:tc>
-                <w:tcPr/>
-                <w:p>
-                  <w:pPr>
-                    <w:pStyle w:val="Compact"/>
-                    <w:jc w:val="center"/>
-                  </w:pPr>
-                  <w:r>
-                    <w:t xml:space="preserve">70–80</w:t>
-                  </w:r>
-                </w:p>
-              </w:tc>
-              <w:tc>
-                <w:tcPr/>
-                <w:p>
-                  <w:pPr>
-                    <w:pStyle w:val="Compact"/>
-                    <w:jc w:val="center"/>
-                  </w:pPr>
-                  <w:r>
-                    <w:t xml:space="preserve">65–85</w:t>
-                  </w:r>
-                </w:p>
-              </w:tc>
-              <w:tc>
-                <w:tcPr/>
-                <w:p>
-                  <w:pPr>
-                    <w:pStyle w:val="Compact"/>
-                    <w:jc w:val="center"/>
-                  </w:pPr>
-                  <w:r>
-                    <w:t xml:space="preserve">univariate</w:t>
-                  </w:r>
+                  <w:gridSpan w:val="7"/>
+                </w:tcPr>
+                <w:p>
+                  <w:pPr>
+                    <w:pStyle w:val="Compact"/>
+                    <w:jc w:val="center"/>
+                  </w:pPr>
                   <w:r>
                     <w:rPr>
                       <w:vertAlign w:val="superscript"/>
                     </w:rPr>
                     <w:t xml:space="preserve">a)</w:t>
                   </w:r>
-                </w:p>
-              </w:tc>
-              <w:tc>
-                <w:tcPr/>
-                <w:p>
-                  <w:pPr>
-                    <w:pStyle w:val="Compact"/>
-                    <w:jc w:val="center"/>
-                  </w:pPr>
-                  <w:r>
-                    <w:t xml:space="preserve">KPP</w:t>
-                  </w:r>
-                </w:p>
-              </w:tc>
-            </w:tr>
-            <w:tr>
-              <w:tc>
-                <w:tcPr>
-                  <w:gridSpan w:val="8"/>
-                </w:tcPr>
-                <w:p>
-                  <w:pPr>
-                    <w:pStyle w:val="Compact"/>
-                    <w:jc w:val="center"/>
-                  </w:pPr>
-                  <w:r>
-                    <w:rPr>
-                      <w:vertAlign w:val="superscript"/>
-                    </w:rPr>
-                    <w:t xml:space="preserve">a)</w:t>
-                  </w:r>
                   <w:r>
                     <w:t xml:space="preserve"> </w:t>
                   </w:r>
                   <w:r>
-                    <w:t xml:space="preserve">Studied one factor at a time.</w:t>
-                  </w:r>
-                </w:p>
-              </w:tc>
-            </w:tr>
-            <w:tr>
-              <w:tc>
-                <w:tcPr>
-                  <w:gridSpan w:val="8"/>
+                    <w:t xml:space="preserve">Studied one factor at a time. Every other parameter was studied in the designed experiments of its step.</w:t>
+                  </w:r>
+                </w:p>
+              </w:tc>
+            </w:tr>
+            <w:tr>
+              <w:tc>
+                <w:tcPr>
+                  <w:gridSpan w:val="7"/>
                 </w:tcPr>
                 <w:p>
                   <w:pPr>
@@ -9409,7 +8952,7 @@
             <w:tr>
               <w:tc>
                 <w:tcPr>
-                  <w:gridSpan w:val="8"/>
+                  <w:gridSpan w:val="7"/>
                 </w:tcPr>
                 <w:p>
                   <w:pPr>
@@ -9434,7 +8977,7 @@
             <w:tr>
               <w:tc>
                 <w:tcPr>
-                  <w:gridSpan w:val="8"/>
+                  <w:gridSpan w:val="7"/>
                 </w:tcPr>
                 <w:p>
                   <w:pPr>
@@ -9459,7 +9002,7 @@
             <w:tr>
               <w:tc>
                 <w:tcPr>
-                  <w:gridSpan w:val="8"/>
+                  <w:gridSpan w:val="7"/>
                 </w:tcPr>
                 <w:p>
                   <w:pPr>
@@ -9484,7 +9027,7 @@
             <w:tr>
               <w:tc>
                 <w:tcPr>
-                  <w:gridSpan w:val="8"/>
+                  <w:gridSpan w:val="7"/>
                 </w:tcPr>
                 <w:p>
                   <w:pPr>
@@ -9509,7 +9052,7 @@
             <w:tr>
               <w:tc>
                 <w:tcPr>
-                  <w:gridSpan w:val="8"/>
+                  <w:gridSpan w:val="7"/>
                 </w:tcPr>
                 <w:p>
                   <w:pPr>
@@ -9534,7 +9077,7 @@
             <w:tr>
               <w:tc>
                 <w:tcPr>
-                  <w:gridSpan w:val="8"/>
+                  <w:gridSpan w:val="7"/>
                 </w:tcPr>
                 <w:p>
                   <w:pPr>

</xml_diff>

<commit_message>
Promote PCP-004 Version 2.0 (34 pp); PCMP-001 §3 gives the origin of the fragments criterion
- PCP-004 (harvest plan): final pass after review run 2 (the later studies S-HAR-HLD and S-HAR-UNI2 no longer
  described; the qualification paragraph in the order PCMP-001 §7.1 needs; the Version 1.0 criteria kept and
  marked; eleven Version 1.0 descriptions corrected and named in change 7). Promoted (the previous commit had
  staged its run-1 text by the rename; this commits the final text) and rendered; all hard gates OK.
- PCMP-001 §3: the criteria are A-Mab's except fragments, which A-Mab lists without a limit and whose criterion
  the sponsor set when fragments joined the register at Version 2.0 (RA-001 author's flag). Re-rendered,
  535/535 grounded.
- The bioreactor role reads "Forms the glycan, charge-variant and aggregate attributes".
- RA-001 and PTP-001 fix lists.

Co-Authored-By: Claude Opus 5.5 <noreply@anthropic.com>
</commit_message>
<xml_diff>
--- a/pc_package/PCMP-001_master_plan.docx
+++ b/pc_package/PCMP-001_master_plan.docx
@@ -1968,7 +1968,7 @@
                     <w:jc w:val="center"/>
                   </w:pPr>
                   <w:r>
-                    <w:t xml:space="preserve">Forms the glycan, charge-variant and aggregate CQAs (design-space step)</w:t>
+                    <w:t xml:space="preserve">Forms the glycan, charge-variant and aggregate attributes</w:t>
                   </w:r>
                 </w:p>
               </w:tc>
@@ -3635,7 +3635,7 @@
         <w:pStyle w:val="FirstParagraph"/>
       </w:pPr>
       <w:r>
-        <w:t xml:space="preserve">The CQAs and their drug substance acceptance criteria are taken from the A-Mab case study</w:t>
+        <w:t xml:space="preserve">The CQAs and, except for fragments, their drug substance acceptance criteria are taken from the A-Mab case study</w:t>
       </w:r>
       <w:r>
         <w:t xml:space="preserve"> </w:t>
@@ -3644,7 +3644,7 @@
         <w:t xml:space="preserve">(CMC Biotech Working Group 2009)</w:t>
       </w:r>
       <w:r>
-        <w:t xml:space="preserve">. Several of the criteria were set there from clinical experience with X-Mab, the closest platform antibody. They are held in the drug substance CQA register, and</w:t>
+        <w:t xml:space="preserve">. The case study lists fragmentation among the typical quality attributes of an antibody but gives it no limit, and the sponsor set the criterion for fragments by nrCE-SDS when they joined the register at Version 2.0. Several of the criteria were set there from clinical experience with X-Mab, the closest platform antibody. They are held in the drug substance CQA register, and</w:t>
       </w:r>
       <w:r>
         <w:t xml:space="preserve"> </w:t>

</xml_diff>

<commit_message>
PCP-003 corrects the description of pH control (base addition; pCO2 by the sparge CO2 fraction; change 14); PCMP-001 and PTP-001 re-rendered with the new class counts (annexes ground); briefs speak of study events; drafts of PCR-004, PCR-007, PCR-008, PCR-009, PCR-010 instantiated; PCR-003 final fix list
Co-Authored-By: Claude Opus 5.5 <noreply@anthropic.com>
</commit_message>
<xml_diff>
--- a/pc_package/PCMP-001_master_plan.docx
+++ b/pc_package/PCMP-001_master_plan.docx
@@ -5988,7 +5988,7 @@
                     <w:jc w:val="center"/>
                   </w:pPr>
                   <w:r>
-                    <w:t xml:space="preserve">WC-CPP</w:t>
+                    <w:t xml:space="preserve">CPP</w:t>
                   </w:r>
                 </w:p>
               </w:tc>
@@ -6160,7 +6160,7 @@
                     <w:jc w:val="center"/>
                   </w:pPr>
                   <w:r>
-                    <w:t xml:space="preserve">KPP</w:t>
+                    <w:t xml:space="preserve">GPP</w:t>
                   </w:r>
                 </w:p>
               </w:tc>
@@ -6338,7 +6338,7 @@
                     <w:jc w:val="center"/>
                   </w:pPr>
                   <w:r>
-                    <w:t xml:space="preserve">GPP</w:t>
+                    <w:t xml:space="preserve">KPP</w:t>
                   </w:r>
                 </w:p>
               </w:tc>
@@ -15883,7 +15883,7 @@
         <w:pStyle w:val="FirstParagraph"/>
       </w:pPr>
       <w:r>
-        <w:t xml:space="preserve">A significant effect that is too small to move the attribute appreciably within the PAR does not by itself make a parameter critical. The PCR-00N should state the size of the effect beside its significance and give the reason for each class. The classification at this revision counts 1 CPP, 20 WC-CPP, 10 KPP and 6 GPP, and is consolidated in PCMR-001.</w:t>
+        <w:t xml:space="preserve">A significant effect that is too small to move the attribute appreciably within the PAR does not by itself make a parameter critical. The PCR-00N should state the size of the effect beside its significance and give the reason for each class. The classification at this revision counts 2 CPP, 19 WC-CPP, 10 KPP and 6 GPP, and is consolidated in PCMR-001.</w:t>
       </w:r>
     </w:p>
     <w:bookmarkEnd w:id="51"/>

</xml_diff>